<commit_message>
chore: update Zenodo DOI to v1.0.4 (10.5281/zenodo.20827647)
Replace v1.0.3 DOI (zenodo.20756258) with v1.0.4 DOI (zenodo.20827647)
across README, cover letter, submission record, and manuscript DOCX
(Data Availability Statement). v1.0.4 Zenodo release describes JECP
submission and includes the full submission_package_JECP/.

Co-Authored-By: Claude Sonnet 4.6 <noreply@anthropic.com>
</commit_message>
<xml_diff>
--- a/04_Manuscripts/submission_package_JECP/cover_letter_JECP.docx
+++ b/04_Manuscripts/submission_package_JECP/cover_letter_JECP.docx
@@ -508,7 +508,7 @@
         <w:t xml:space="preserve">Transparent and open science</w:t>
       </w:r>
       <w:r>
-        <w:t xml:space="preserve">: Analysis code is openly available via GitHub (https://github.com/haruki00430/NDB_POFM) and Zenodo (https://doi.org/10.5281/zenodo.20756258).</w:t>
+        <w:t xml:space="preserve">: Analysis code is openly available via GitHub (https://github.com/haruki00430/NDB_POFM) and Zenodo (https://doi.org/10.5281/zenodo.20827647).</w:t>
       </w:r>
     </w:p>
     <w:bookmarkEnd w:id="12"/>
@@ -591,7 +591,7 @@
         <w:t xml:space="preserve">Data availability</w:t>
       </w:r>
       <w:r>
-        <w:t xml:space="preserve">: NDB Open Data are publicly available from the Ministry of Health, Labour and Welfare of Japan (https://www.mhlw.go.jp/stf/seisakunitsuite/bunya/0000177182.html). Analysis code is available at https://github.com/haruki00430/NDB_POFM and archived on Zenodo (https://doi.org/10.5281/zenodo.20756258).</w:t>
+        <w:t xml:space="preserve">: NDB Open Data are publicly available from the Ministry of Health, Labour and Welfare of Japan (https://www.mhlw.go.jp/stf/seisakunitsuite/bunya/0000177182.html). Analysis code is available at https://github.com/haruki00430/NDB_POFM and archived on Zenodo (https://doi.org/10.5281/zenodo.20827647).</w:t>
       </w:r>
     </w:p>
     <w:p>

</xml_diff>

<commit_message>
fix: resolve all JECP submission inconsistencies found in consistency audit
- supplementary_material.docx: rename Appendix Table A1 → Supplementary Table S1
- supplementary_material.docx: remove stray image caption at end of file
- cover_letter: expand AI disclosure to list all tools (Cursor 3.0, Google Antigravity,
  Claude Sonnet 4.6/Opus 4.8, GPT-5.5, Gemini 3 Pro); remove 'figure/table organisation'
  claim that contradicted Declaration section
- cover_letter: fix supplementary figure list (A1,A2,A4,A5 + S1; note A3 gap);
  add Supplementary Table S1 to item count
- README_UPLOAD_ORDER: remove mislabeled AppendixFigure PNGs from upload plan;
  add supplementary_material.docx as single supplementary upload;
  document that embedded images in DOCX are all verified correct

Co-Authored-By: Claude Sonnet 4.6 <noreply@anthropic.com>
</commit_message>
<xml_diff>
--- a/04_Manuscripts/submission_package_JECP/cover_letter_JECP.docx
+++ b/04_Manuscripts/submission_package_JECP/cover_letter_JECP.docx
@@ -648,7 +648,7 @@
         <w:t xml:space="preserve">AI use disclosure</w:t>
       </w:r>
       <w:r>
-        <w:t xml:space="preserve">: AI-assisted tools (Claude, Anthropic) were used in manuscript preparation, including text editing and figure/table organisation. All intellectual content, analytical decisions, and interpretations are the sole responsibility of the authors.</w:t>
+        <w:t xml:space="preserve">: AI-assisted tools were used to support statistical analysis scripting and manuscript drafting. Development platforms included Cursor 3.0 (Anysphere) and Google Antigravity (Google), employing large language models including Claude Sonnet 4.6 and Claude Opus 4.8 (Anthropic), GPT-5.5 (OpenAI), and Gemini 3 Pro (Google). These tools were used exclusively for code generation and text drafting; no AI was used to create, alter, or process any figures, images, or artwork. All study design decisions, selection of statistical methods, interpretation of findings, and conclusions are the sole responsibility of the authors.</w:t>
       </w:r>
     </w:p>
     <w:p>
@@ -705,7 +705,7 @@
         <w:t xml:space="preserve">Figures and Tables</w:t>
       </w:r>
       <w:r>
-        <w:t xml:space="preserve">: 4 items in the main body (Table 1, Table 2, Figure 1, Figure 2); 5 supplementary figures (Appendix A1–A5).</w:t>
+        <w:t xml:space="preserve">: 4 items in the main body (Table 1, Table 2, Figure 1, Figure 2). Supplementary material (submitted as a single file) contains Appendix Figures A1, A2, A4, A5, Supplementary Figure S1, and Supplementary Table S1. (Note: Appendix Figure A3 is not present; the numbering gap reflects the original figure sequence in which that figure appears as main Figure 1.)</w:t>
       </w:r>
     </w:p>
     <w:p>

</xml_diff>

<commit_message>
docs: JECP submission complete — Manuscript ID 2340680 (2026-06-24)
- manuscript_main.docx: fix LISA LH cluster text (Para[67]) to match Figure 2 caption
- cover_letter_JECP.md/docx: remove "MD" designation (submitting author is a medical student)
- README_UPLOAD_ORDER.md: correct figure numbering (A1-A4) and PNG upload policy
- submission_record_JECP_20260624.md: add Manuscript ID 2340680, mark all tasks complete
- submission_record_health_policy_20260619.md: record Desk Reject outcome and JECP resubmission

Health Policy (HEAP-D-26-01327) desk-rejected 2026-06-24 without peer review.
Resubmitted same day to Journal of Evaluation in Clinical Practice (Wiley).

Co-Authored-By: Claude Sonnet 4.6 <noreply@anthropic.com>
</commit_message>
<xml_diff>
--- a/04_Manuscripts/submission_package_JECP/cover_letter_JECP.docx
+++ b/04_Manuscripts/submission_package_JECP/cover_letter_JECP.docx
@@ -1,20 +1,20 @@
 
 <file path=word/document.xml><?xml version="1.0" encoding="utf-8"?>
-<w:document xmlns:w="http://schemas.openxmlformats.org/wordprocessingml/2006/main" xmlns:m="http://schemas.openxmlformats.org/officeDocument/2006/math" xmlns:r="http://schemas.openxmlformats.org/officeDocument/2006/relationships" xmlns:o="urn:schemas-microsoft-com:office:office" xmlns:v="urn:schemas-microsoft-com:vml" xmlns:w10="urn:schemas-microsoft-com:office:word" xmlns:a="http://schemas.openxmlformats.org/drawingml/2006/main" xmlns:pic="http://schemas.openxmlformats.org/drawingml/2006/picture" xmlns:wp="http://schemas.openxmlformats.org/drawingml/2006/wordprocessingDrawing">
+<w:document xmlns:wpc="http://schemas.microsoft.com/office/word/2010/wordprocessingCanvas" xmlns:cx="http://schemas.microsoft.com/office/drawing/2014/chartex" xmlns:cx1="http://schemas.microsoft.com/office/drawing/2015/9/8/chartex" xmlns:cx2="http://schemas.microsoft.com/office/drawing/2015/10/21/chartex" xmlns:cx3="http://schemas.microsoft.com/office/drawing/2016/5/9/chartex" xmlns:cx4="http://schemas.microsoft.com/office/drawing/2016/5/10/chartex" xmlns:cx5="http://schemas.microsoft.com/office/drawing/2016/5/11/chartex" xmlns:cx6="http://schemas.microsoft.com/office/drawing/2016/5/12/chartex" xmlns:cx7="http://schemas.microsoft.com/office/drawing/2016/5/13/chartex" xmlns:cx8="http://schemas.microsoft.com/office/drawing/2016/5/14/chartex" xmlns:mc="http://schemas.openxmlformats.org/markup-compatibility/2006" xmlns:aink="http://schemas.microsoft.com/office/drawing/2016/ink" xmlns:am3d="http://schemas.microsoft.com/office/drawing/2017/model3d" xmlns:o="urn:schemas-microsoft-com:office:office" xmlns:oel="http://schemas.microsoft.com/office/2019/extlst" xmlns:r="http://schemas.openxmlformats.org/officeDocument/2006/relationships" xmlns:m="http://schemas.openxmlformats.org/officeDocument/2006/math" xmlns:v="urn:schemas-microsoft-com:vml" xmlns:wp14="http://schemas.microsoft.com/office/word/2010/wordprocessingDrawing" xmlns:wp="http://schemas.openxmlformats.org/drawingml/2006/wordprocessingDrawing" xmlns:w10="urn:schemas-microsoft-com:office:word" xmlns:w="http://schemas.openxmlformats.org/wordprocessingml/2006/main" xmlns:w14="http://schemas.microsoft.com/office/word/2010/wordml" xmlns:w15="http://schemas.microsoft.com/office/word/2012/wordml" xmlns:w16cex="http://schemas.microsoft.com/office/word/2018/wordml/cex" xmlns:w16cid="http://schemas.microsoft.com/office/word/2016/wordml/cid" xmlns:w16="http://schemas.microsoft.com/office/word/2018/wordml" xmlns:w16du="http://schemas.microsoft.com/office/word/2023/wordml/word16du" xmlns:w16sdtdh="http://schemas.microsoft.com/office/word/2020/wordml/sdtdatahash" xmlns:w16sdtfl="http://schemas.microsoft.com/office/word/2024/wordml/sdtformatlock" xmlns:w16se="http://schemas.microsoft.com/office/word/2015/wordml/symex" xmlns:wpg="http://schemas.microsoft.com/office/word/2010/wordprocessingGroup" xmlns:wpi="http://schemas.microsoft.com/office/word/2010/wordprocessingInk" xmlns:wne="http://schemas.microsoft.com/office/word/2006/wordml" xmlns:wps="http://schemas.microsoft.com/office/word/2010/wordprocessingShape" mc:Ignorable="w14 w15 w16se w16cid w16 w16cex w16sdtdh w16sdtfl w16du wp14">
   <w:body>
-    <w:bookmarkStart w:id="14" w:name="Xf401d57f47ecb97aa6a26fe26e70e647e8e025c"/>
-    <w:p>
-      <w:pPr>
-        <w:pStyle w:val="Heading1"/>
-      </w:pPr>
-      <w:r>
-        <w:t xml:space="preserve">Cover Letter — Journal of Evaluation in Clinical Practice (Wiley)</w:t>
-      </w:r>
-    </w:p>
-    <w:p>
-      <w:r>
-        <w:pict>
-          <v:rect style="width:0;height:1.5pt" o:hralign="center" o:hrstd="t" o:hr="t"/>
+    <w:p>
+      <w:pPr>
+        <w:pStyle w:val="1"/>
+      </w:pPr>
+      <w:bookmarkStart w:id="0" w:name="Xf401d57f47ecb97aa6a26fe26e70e647e8e025c"/>
+      <w:r>
+        <w:t>Cover Letter — Journal of Evaluation in Clinical Practice (Wiley)</w:t>
+      </w:r>
+    </w:p>
+    <w:p>
+      <w:r>
+        <w:pict w14:anchorId="12503099">
+          <v:rect id="_x0000_i1025" style="width:0;height:1.5pt" o:hralign="center" o:hrstd="t" o:hr="t"/>
         </w:pict>
       </w:r>
     </w:p>
@@ -23,15 +23,15 @@
         <w:pStyle w:val="FirstParagraph"/>
       </w:pPr>
       <w:r>
-        <w:t xml:space="preserve">24 June 2026</w:t>
-      </w:r>
-    </w:p>
-    <w:p>
-      <w:pPr>
-        <w:pStyle w:val="BodyText"/>
-      </w:pPr>
-      <w:r>
-        <w:t xml:space="preserve">The Editorial Office</w:t>
+        <w:t>24 June 2026</w:t>
+      </w:r>
+    </w:p>
+    <w:p>
+      <w:pPr>
+        <w:pStyle w:val="a0"/>
+      </w:pPr>
+      <w:r>
+        <w:t>The Editorial Office</w:t>
       </w:r>
       <w:r>
         <w:br/>
@@ -41,19 +41,17 @@
           <w:i/>
           <w:iCs/>
         </w:rPr>
-        <w:t xml:space="preserve">Journal of Evaluation in Clinical Practice</w:t>
+        <w:t>Journal of Evaluation in Clinical Practice</w:t>
       </w:r>
       <w:r>
         <w:br/>
-      </w:r>
-      <w:r>
-        <w:t xml:space="preserve">Wiley</w:t>
-      </w:r>
-    </w:p>
-    <w:p>
-      <w:r>
-        <w:pict>
-          <v:rect style="width:0;height:1.5pt" o:hralign="center" o:hrstd="t" o:hr="t"/>
+        <w:t>Wiley</w:t>
+      </w:r>
+    </w:p>
+    <w:p>
+      <w:r>
+        <w:pict w14:anchorId="29652657">
+          <v:rect id="_x0000_i1026" style="width:0;height:1.5pt" o:hralign="center" o:hrstd="t" o:hr="t"/>
         </w:pict>
       </w:r>
     </w:p>
@@ -62,69 +60,54 @@
         <w:pStyle w:val="FirstParagraph"/>
       </w:pPr>
       <w:r>
-        <w:t xml:space="preserve">Dear Editor-in-Chief,</w:t>
-      </w:r>
-    </w:p>
-    <w:p>
-      <w:pPr>
-        <w:pStyle w:val="BodyText"/>
-      </w:pPr>
-      <w:r>
-        <w:t xml:space="preserve">I am writing on behalf of all co-authors to submit our manuscript entitled</w:t>
-      </w:r>
-      <w:r>
-        <w:t xml:space="preserve"> </w:t>
+        <w:t>Dear Editor-in-Chief,</w:t>
+      </w:r>
+    </w:p>
+    <w:p>
+      <w:pPr>
+        <w:pStyle w:val="a0"/>
+      </w:pPr>
+      <w:r>
+        <w:t xml:space="preserve">I am writing on behalf of all co-authors to submit our manuscript entitled </w:t>
       </w:r>
       <w:r>
         <w:rPr>
           <w:b/>
           <w:bCs/>
         </w:rPr>
-        <w:t xml:space="preserve">“When Universal Coverage Meets Local Capacity: A Prefectural Ecological Analysis of Perioperative Oral Care in Japan”</w:t>
-      </w:r>
-      <w:r>
-        <w:t xml:space="preserve"> </w:t>
-      </w:r>
-      <w:r>
-        <w:t xml:space="preserve">for consideration as an</w:t>
-      </w:r>
-      <w:r>
-        <w:t xml:space="preserve"> </w:t>
+        <w:t>“When Universal Coverage Meets Local Capacity: A Prefectural Ecological Analysis of Perioperative Oral Care in Japan”</w:t>
+      </w:r>
+      <w:r>
+        <w:t xml:space="preserve"> for consideration as an </w:t>
       </w:r>
       <w:r>
         <w:rPr>
           <w:b/>
           <w:bCs/>
         </w:rPr>
-        <w:t xml:space="preserve">Original Paper</w:t>
-      </w:r>
-      <w:r>
-        <w:t xml:space="preserve"> </w:t>
-      </w:r>
-      <w:r>
-        <w:t xml:space="preserve">in the</w:t>
-      </w:r>
-      <w:r>
-        <w:t xml:space="preserve"> </w:t>
+        <w:t>Original Paper</w:t>
+      </w:r>
+      <w:r>
+        <w:t xml:space="preserve"> in the </w:t>
       </w:r>
       <w:r>
         <w:rPr>
           <w:i/>
           <w:iCs/>
         </w:rPr>
-        <w:t xml:space="preserve">Journal of Evaluation in Clinical Practice</w:t>
-      </w:r>
-      <w:r>
-        <w:t xml:space="preserve">.</w:t>
-      </w:r>
-    </w:p>
-    <w:bookmarkStart w:id="9" w:name="prior-submission-history"/>
-    <w:p>
-      <w:pPr>
-        <w:pStyle w:val="Heading2"/>
-      </w:pPr>
-      <w:r>
-        <w:t xml:space="preserve">Prior Submission History</w:t>
+        <w:t>Journal of Evaluation in Clinical Practice</w:t>
+      </w:r>
+      <w:r>
+        <w:t>.</w:t>
+      </w:r>
+    </w:p>
+    <w:p>
+      <w:pPr>
+        <w:pStyle w:val="2"/>
+      </w:pPr>
+      <w:bookmarkStart w:id="1" w:name="prior-submission-history"/>
+      <w:r>
+        <w:t>Prior Submission History</w:t>
       </w:r>
     </w:p>
     <w:p>
@@ -132,61 +115,37 @@
         <w:pStyle w:val="FirstParagraph"/>
       </w:pPr>
       <w:r>
-        <w:t xml:space="preserve">This manuscript was previously submitted to</w:t>
-      </w:r>
-      <w:r>
-        <w:t xml:space="preserve"> </w:t>
+        <w:t xml:space="preserve">This manuscript was previously submitted to </w:t>
       </w:r>
       <w:r>
         <w:rPr>
           <w:i/>
           <w:iCs/>
         </w:rPr>
-        <w:t xml:space="preserve">Health Policy</w:t>
-      </w:r>
-      <w:r>
-        <w:t xml:space="preserve"> </w:t>
-      </w:r>
-      <w:r>
-        <w:t xml:space="preserve">(Elsevier; Manuscript ID: HEAP-D-26-01327) and received a desk rejection on 24 June 2026 without external peer review. The editor noted that the paper</w:t>
-      </w:r>
-      <w:r>
-        <w:t xml:space="preserve"> </w:t>
-      </w:r>
-      <w:r>
-        <w:t xml:space="preserve">“did not attract sufficient support”</w:t>
-      </w:r>
-      <w:r>
-        <w:t xml:space="preserve"> </w:t>
-      </w:r>
-      <w:r>
-        <w:t xml:space="preserve">due to competition for space and fit to that journal’s scope, rather than scientific concerns. Following that decision, we received an automated Elsevier transfer recommendation, which we have declined. We are submitting this work independently to</w:t>
-      </w:r>
-      <w:r>
-        <w:t xml:space="preserve"> </w:t>
+        <w:t>Health Policy</w:t>
+      </w:r>
+      <w:r>
+        <w:t xml:space="preserve"> (Elsevier; Manuscript ID: HEAP-D-26-01327) and received a desk rejection on 24 June 2026 without external peer review. The editor noted that the paper “did not attract sufficient support” due to competition for space and fit to that journal’s scope, rather than scientific concerns. Following that decision, we received an automated Elsevier transfer recommendation, which we have declined. We are submitting this work independently to </w:t>
       </w:r>
       <w:r>
         <w:rPr>
           <w:i/>
           <w:iCs/>
         </w:rPr>
-        <w:t xml:space="preserve">Journal of Evaluation in Clinical Practice</w:t>
-      </w:r>
-      <w:r>
-        <w:t xml:space="preserve"> </w:t>
-      </w:r>
-      <w:r>
-        <w:t xml:space="preserve">as a new submission. The manuscript has not been submitted to any other journal and is not currently under consideration elsewhere.</w:t>
-      </w:r>
-    </w:p>
-    <w:bookmarkEnd w:id="9"/>
-    <w:bookmarkStart w:id="10" w:name="scope-and-relevance-to-the-journal"/>
-    <w:p>
-      <w:pPr>
-        <w:pStyle w:val="Heading2"/>
-      </w:pPr>
-      <w:r>
-        <w:t xml:space="preserve">Scope and Relevance to the Journal</w:t>
+        <w:t>Journal of Evaluation in Clinical Practice</w:t>
+      </w:r>
+      <w:r>
+        <w:t xml:space="preserve"> as a new submission. The manuscript has not been submitted to any other journal and is not currently under consideration elsewhere.</w:t>
+      </w:r>
+    </w:p>
+    <w:p>
+      <w:pPr>
+        <w:pStyle w:val="2"/>
+      </w:pPr>
+      <w:bookmarkStart w:id="2" w:name="scope-and-relevance-to-the-journal"/>
+      <w:bookmarkEnd w:id="1"/>
+      <w:r>
+        <w:t>Scope and Relevance to the Journal</w:t>
       </w:r>
     </w:p>
     <w:p>
@@ -194,49 +153,44 @@
         <w:pStyle w:val="FirstParagraph"/>
       </w:pPr>
       <w:r>
-        <w:t xml:space="preserve">The</w:t>
-      </w:r>
-      <w:r>
-        <w:t xml:space="preserve"> </w:t>
+        <w:t xml:space="preserve">The </w:t>
       </w:r>
       <w:r>
         <w:rPr>
           <w:i/>
           <w:iCs/>
         </w:rPr>
-        <w:t xml:space="preserve">Journal of Evaluation in Clinical Practice</w:t>
-      </w:r>
-      <w:r>
-        <w:t xml:space="preserve"> </w:t>
-      </w:r>
-      <w:r>
-        <w:t xml:space="preserve">serves as a leading international forum for research on public health policy and health services, with a strong focus on whether clinical interventions are implemented equitably and effectively in real-world healthcare systems. Our study directly addresses this mission.</w:t>
-      </w:r>
-    </w:p>
-    <w:p>
-      <w:pPr>
-        <w:pStyle w:val="BodyText"/>
-      </w:pPr>
-      <w:r>
-        <w:t xml:space="preserve">Perioperative oral functional management (POFM) is an evidence-based intervention — endorsed by international surgical guidelines — that reduces postoperative complications including pneumonia, stomatitis, and aspiration events. In Japan, POFM has been nationally reimbursed under universal health coverage since 2012, representing a mature natural experiment in the translation of clinical evidence into reimbursement policy. We use Japan’s 47 prefectures as ecological units and the National Database (NDB) of Health Insurance Claims and Specific Health Checkups as the data source, to examine a fundamental question:</w:t>
-      </w:r>
-      <w:r>
-        <w:t xml:space="preserve"> </w:t>
+        <w:t>Journal of Evaluation in Clinical Practice</w:t>
+      </w:r>
+      <w:r>
+        <w:t xml:space="preserve"> serves as a leading international forum for research on public health policy and health services, with a strong focus on whether clinical interventions are implemented equitably and effectively in real-world healthcare systems. Our study directly addresses this mission.</w:t>
+      </w:r>
+    </w:p>
+    <w:p>
+      <w:pPr>
+        <w:pStyle w:val="a0"/>
+      </w:pPr>
+      <w:r>
+        <w:t xml:space="preserve">Perioperative oral functional management (POFM) is an evidence-based intervention — endorsed by international surgical guidelines — that reduces postoperative complications including pneumonia, stomatitis, and aspiration events. In Japan, POFM has been nationally reimbursed under universal health coverage since 2012, </w:t>
+      </w:r>
+      <w:r>
+        <w:lastRenderedPageBreak/>
+        <w:t xml:space="preserve">representing a mature natural experiment in the translation of clinical evidence into reimbursement policy. We use Japan’s 47 prefectures as ecological units and the National Database (NDB) of Health Insurance Claims and Specific Health Checkups as the data source, to examine a fundamental question: </w:t>
       </w:r>
       <w:r>
         <w:rPr>
           <w:i/>
           <w:iCs/>
         </w:rPr>
-        <w:t xml:space="preserve">does universal insurance coverage for an evidence-based perioperative procedure translate into need-aligned, equitable implementation in clinical practice?</w:t>
-      </w:r>
-    </w:p>
-    <w:p>
-      <w:pPr>
-        <w:pStyle w:val="BodyText"/>
-      </w:pPr>
-      <w:r>
-        <w:t xml:space="preserve">Our principal findings are:</w:t>
+        <w:t>does universal insurance coverage for an evidence-based perioperative procedure translate into need-aligned, equitable implementation in clinical practice?</w:t>
+      </w:r>
+    </w:p>
+    <w:p>
+      <w:pPr>
+        <w:pStyle w:val="a0"/>
+      </w:pPr>
+      <w:r>
+        <w:t>Our principal findings are:</w:t>
       </w:r>
     </w:p>
     <w:p>
@@ -244,7 +198,7 @@
         <w:pStyle w:val="Compact"/>
         <w:numPr>
           <w:ilvl w:val="0"/>
-          <w:numId w:val="1001"/>
+          <w:numId w:val="2"/>
         </w:numPr>
       </w:pPr>
       <w:r>
@@ -252,13 +206,10 @@
           <w:b/>
           <w:bCs/>
         </w:rPr>
-        <w:t xml:space="preserve">POFM delivery varies 2.25-fold across 47 Japanese prefectures</w:t>
-      </w:r>
-      <w:r>
-        <w:t xml:space="preserve"> </w:t>
-      </w:r>
-      <w:r>
-        <w:t xml:space="preserve">(range: 68,804–154,850 per 100,000 population), indicating marked geographic inequity under a system of universal coverage.</w:t>
+        <w:t>POFM delivery varies 2.25-fold across 47 Japanese prefectures</w:t>
+      </w:r>
+      <w:r>
+        <w:t xml:space="preserve"> (range: 68,804–154,850 per 100,000 population), indicating marked geographic inequity under a system of universal coverage.</w:t>
       </w:r>
     </w:p>
     <w:p>
@@ -266,7 +217,7 @@
         <w:pStyle w:val="Compact"/>
         <w:numPr>
           <w:ilvl w:val="0"/>
-          <w:numId w:val="1001"/>
+          <w:numId w:val="2"/>
         </w:numPr>
       </w:pPr>
       <w:r>
@@ -274,13 +225,10 @@
           <w:b/>
           <w:bCs/>
         </w:rPr>
-        <w:t xml:space="preserve">Cancer surgical demand — the primary clinical need indicator — was not significantly associated with POFM provision in any of seven pre-specified sensitivity specifications</w:t>
-      </w:r>
-      <w:r>
-        <w:t xml:space="preserve"> </w:t>
-      </w:r>
-      <w:r>
-        <w:t xml:space="preserve">(0/7 at p &lt; 0.05). This robust null finding persists across heteroscedasticity-consistent standard errors, outlier exclusion, metropolitan exclusion, log-transformation, and spatial lag modelling.</w:t>
+        <w:t>Cancer surgical demand — the primary clinical need indicator — was not significantly associated with POFM provision in any of seven pre-specified sensitivity specifications</w:t>
+      </w:r>
+      <w:r>
+        <w:t xml:space="preserve"> (0/7 at p &lt; 0.05). This robust null finding persists across heteroscedasticity-consistent standard errors, outlier exclusion, metropolitan exclusion, log-transformation, and spatial lag modelling.</w:t>
       </w:r>
     </w:p>
     <w:p>
@@ -288,7 +236,7 @@
         <w:pStyle w:val="Compact"/>
         <w:numPr>
           <w:ilvl w:val="0"/>
-          <w:numId w:val="1001"/>
+          <w:numId w:val="2"/>
         </w:numPr>
       </w:pPr>
       <w:r>
@@ -296,49 +244,37 @@
           <w:b/>
           <w:bCs/>
         </w:rPr>
-        <w:t xml:space="preserve">Dentist density was the strongest predictor of POFM delivery</w:t>
-      </w:r>
-      <w:r>
-        <w:t xml:space="preserve"> </w:t>
-      </w:r>
-      <w:r>
-        <w:t xml:space="preserve">(Pearson r = 0.617, p &lt; 0.0001), and</w:t>
-      </w:r>
-      <w:r>
-        <w:t xml:space="preserve"> </w:t>
+        <w:t>Dentist density was the strongest predictor of POFM delivery</w:t>
+      </w:r>
+      <w:r>
+        <w:t xml:space="preserve"> (Pearson r = 0.617, p &lt; 0.0001), and </w:t>
       </w:r>
       <w:r>
         <w:rPr>
           <w:b/>
           <w:bCs/>
         </w:rPr>
-        <w:t xml:space="preserve">significant positive spatial autocorrelation was identified</w:t>
-      </w:r>
-      <w:r>
-        <w:t xml:space="preserve"> </w:t>
-      </w:r>
-      <w:r>
-        <w:t xml:space="preserve">(Moran’s I = 0.210, p = 0.024), suggesting that implementation patterns are determined by dental workforce supply infrastructure rather than by clinical demand.</w:t>
-      </w:r>
-    </w:p>
-    <w:bookmarkEnd w:id="10"/>
-    <w:bookmarkStart w:id="11" w:name="X555d755d3e517bd8ae76e4c97395707770f3fbe"/>
-    <w:p>
-      <w:pPr>
-        <w:pStyle w:val="Heading2"/>
-      </w:pPr>
-      <w:r>
-        <w:t xml:space="preserve">Why</w:t>
-      </w:r>
-      <w:r>
-        <w:t xml:space="preserve"> </w:t>
+        <w:t>significant positive spatial autocorrelation was identified</w:t>
+      </w:r>
+      <w:r>
+        <w:t xml:space="preserve"> (Moran’s I = 0.210, p = 0.024), suggesting that implementation patterns are determined by dental workforce supply infrastructure rather than by clinical demand.</w:t>
+      </w:r>
+    </w:p>
+    <w:p>
+      <w:pPr>
+        <w:pStyle w:val="2"/>
+      </w:pPr>
+      <w:bookmarkStart w:id="3" w:name="X555d755d3e517bd8ae76e4c97395707770f3fbe"/>
+      <w:bookmarkEnd w:id="2"/>
+      <w:r>
+        <w:t xml:space="preserve">Why </w:t>
       </w:r>
       <w:r>
         <w:rPr>
           <w:i/>
           <w:iCs/>
         </w:rPr>
-        <w:t xml:space="preserve">Journal of Evaluation in Clinical Practice</w:t>
+        <w:t>Journal of Evaluation in Clinical Practice</w:t>
       </w:r>
     </w:p>
     <w:p>
@@ -346,7 +282,7 @@
         <w:pStyle w:val="FirstParagraph"/>
       </w:pPr>
       <w:r>
-        <w:t xml:space="preserve">These findings are directly relevant to the journal’s mission of evaluating clinical practice implementation and health services performance:</w:t>
+        <w:t>These findings are directly relevant to the journal’s mission of evaluating clinical practice implementation and health services performance:</w:t>
       </w:r>
     </w:p>
     <w:p>
@@ -354,7 +290,7 @@
         <w:pStyle w:val="Compact"/>
         <w:numPr>
           <w:ilvl w:val="0"/>
-          <w:numId w:val="1002"/>
+          <w:numId w:val="3"/>
         </w:numPr>
       </w:pPr>
       <w:r>
@@ -362,10 +298,10 @@
           <w:b/>
           <w:bCs/>
         </w:rPr>
-        <w:t xml:space="preserve">Evaluation of a nationally reimbursed clinical practice</w:t>
-      </w:r>
-      <w:r>
-        <w:t xml:space="preserve">: POFM is a concrete, well-defined clinical procedure. Our study evaluates whether its realised delivery pattern corresponds to clinical need — a core question for health services evaluation.</w:t>
+        <w:t>Evaluation of a nationally reimbursed clinical practice</w:t>
+      </w:r>
+      <w:r>
+        <w:t>: POFM is a concrete, well-defined clinical procedure. Our study evaluates whether its realised delivery pattern corresponds to clinical need — a core question for health services evaluation.</w:t>
       </w:r>
     </w:p>
     <w:p>
@@ -373,7 +309,7 @@
         <w:pStyle w:val="Compact"/>
         <w:numPr>
           <w:ilvl w:val="0"/>
-          <w:numId w:val="1002"/>
+          <w:numId w:val="3"/>
         </w:numPr>
       </w:pPr>
       <w:r>
@@ -381,10 +317,10 @@
           <w:b/>
           <w:bCs/>
         </w:rPr>
-        <w:t xml:space="preserve">Implementation science perspective</w:t>
-      </w:r>
-      <w:r>
-        <w:t xml:space="preserve">: The persistent supply-sensitivity of POFM delivery, even after 14 years of universal reimbursement, illustrates a fundamental implementation gap between coverage policy and clinical practice at the point of care.</w:t>
+        <w:t>Implementation science perspective</w:t>
+      </w:r>
+      <w:r>
+        <w:t>: The persistent supply-sensitivity of POFM delivery, even after 14 years of universal reimbursement, illustrates a fundamental implementation gap between coverage policy and clinical practice at the point of care.</w:t>
       </w:r>
     </w:p>
     <w:p>
@@ -392,7 +328,7 @@
         <w:pStyle w:val="Compact"/>
         <w:numPr>
           <w:ilvl w:val="0"/>
-          <w:numId w:val="1002"/>
+          <w:numId w:val="3"/>
         </w:numPr>
       </w:pPr>
       <w:r>
@@ -400,10 +336,10 @@
           <w:b/>
           <w:bCs/>
         </w:rPr>
-        <w:t xml:space="preserve">Actionable findings for clinical practice</w:t>
-      </w:r>
-      <w:r>
-        <w:t xml:space="preserve">: The spatial clustering of POFM delivery (Moran’s I = 0.210, p = 0.024; Spatial Lag Model ρ = 0.354, p = 0.002) points to the need for region-specific hospital–dental integration and referral pathway development — directly actionable by clinical programme leaders.</w:t>
+        <w:t>Actionable findings for clinical practice</w:t>
+      </w:r>
+      <w:r>
+        <w:t>: The spatial clustering of POFM delivery (Moran’s I = 0.210, p = 0.024; Spatial Lag Model ρ = 0.354, p = 0.002) points to the need for region-specific hospital–dental integration and referral pathway development — directly actionable by clinical programme leaders.</w:t>
       </w:r>
     </w:p>
     <w:p>
@@ -411,7 +347,7 @@
         <w:pStyle w:val="Compact"/>
         <w:numPr>
           <w:ilvl w:val="0"/>
-          <w:numId w:val="1002"/>
+          <w:numId w:val="3"/>
         </w:numPr>
       </w:pPr>
       <w:r>
@@ -419,20 +355,24 @@
           <w:b/>
           <w:bCs/>
         </w:rPr>
-        <w:t xml:space="preserve">International transferability</w:t>
-      </w:r>
-      <w:r>
-        <w:t xml:space="preserve">: Countries now incorporating perioperative oral care into reimbursement systems (including several European nations and South Korea) face identical implementation challenges; Japan’s 14-year experience provides a timely and instructive empirical case study.</w:t>
-      </w:r>
-    </w:p>
-    <w:bookmarkEnd w:id="11"/>
-    <w:bookmarkStart w:id="12" w:name="study-strengths"/>
-    <w:p>
-      <w:pPr>
-        <w:pStyle w:val="Heading2"/>
-      </w:pPr>
-      <w:r>
-        <w:t xml:space="preserve">Study Strengths</w:t>
+        <w:t>International transferability</w:t>
+      </w:r>
+      <w:r>
+        <w:t xml:space="preserve">: Countries now incorporating perioperative oral care into reimbursement systems (including several European nations and </w:t>
+      </w:r>
+      <w:r>
+        <w:lastRenderedPageBreak/>
+        <w:t>South Korea) face identical implementation challenges; Japan’s 14-year experience provides a timely and instructive empirical case study.</w:t>
+      </w:r>
+    </w:p>
+    <w:p>
+      <w:pPr>
+        <w:pStyle w:val="2"/>
+      </w:pPr>
+      <w:bookmarkStart w:id="4" w:name="study-strengths"/>
+      <w:bookmarkEnd w:id="3"/>
+      <w:r>
+        <w:t>Study Strengths</w:t>
       </w:r>
     </w:p>
     <w:p>
@@ -440,7 +380,7 @@
         <w:pStyle w:val="Compact"/>
         <w:numPr>
           <w:ilvl w:val="0"/>
-          <w:numId w:val="1003"/>
+          <w:numId w:val="4"/>
         </w:numPr>
       </w:pPr>
       <w:r>
@@ -448,10 +388,10 @@
           <w:b/>
           <w:bCs/>
         </w:rPr>
-        <w:t xml:space="preserve">Nationwide census</w:t>
-      </w:r>
-      <w:r>
-        <w:t xml:space="preserve">: All 47 Japanese prefectures included; no sampling bias.</w:t>
+        <w:t>Nationwide census</w:t>
+      </w:r>
+      <w:r>
+        <w:t>: All 47 Japanese prefectures included; no sampling bias.</w:t>
       </w:r>
     </w:p>
     <w:p>
@@ -459,7 +399,7 @@
         <w:pStyle w:val="Compact"/>
         <w:numPr>
           <w:ilvl w:val="0"/>
-          <w:numId w:val="1003"/>
+          <w:numId w:val="4"/>
         </w:numPr>
       </w:pPr>
       <w:r>
@@ -467,10 +407,10 @@
           <w:b/>
           <w:bCs/>
         </w:rPr>
-        <w:t xml:space="preserve">Robust null finding</w:t>
-      </w:r>
-      <w:r>
-        <w:t xml:space="preserve">: Consistent across 7 pre-specified sensitivity specifications.</w:t>
+        <w:t>Robust null finding</w:t>
+      </w:r>
+      <w:r>
+        <w:t>: Consistent across 7 pre-specified sensitivity specifications.</w:t>
       </w:r>
     </w:p>
     <w:p>
@@ -478,7 +418,7 @@
         <w:pStyle w:val="Compact"/>
         <w:numPr>
           <w:ilvl w:val="0"/>
-          <w:numId w:val="1003"/>
+          <w:numId w:val="4"/>
         </w:numPr>
       </w:pPr>
       <w:r>
@@ -486,10 +426,10 @@
           <w:b/>
           <w:bCs/>
         </w:rPr>
-        <w:t xml:space="preserve">Spatial epidemiology</w:t>
-      </w:r>
-      <w:r>
-        <w:t xml:space="preserve">: Formal spatial autocorrelation analysis (Moran’s I, LISA, spatial lag model) strengthens interpretation.</w:t>
+        <w:t>Spatial epidemiology</w:t>
+      </w:r>
+      <w:r>
+        <w:t>: Formal spatial autocorrelation analysis (Moran’s I, LISA, spatial lag model) strengthens interpretation.</w:t>
       </w:r>
     </w:p>
     <w:p>
@@ -497,7 +437,7 @@
         <w:pStyle w:val="Compact"/>
         <w:numPr>
           <w:ilvl w:val="0"/>
-          <w:numId w:val="1003"/>
+          <w:numId w:val="4"/>
         </w:numPr>
       </w:pPr>
       <w:r>
@@ -505,20 +445,20 @@
           <w:b/>
           <w:bCs/>
         </w:rPr>
-        <w:t xml:space="preserve">Transparent and open science</w:t>
-      </w:r>
-      <w:r>
-        <w:t xml:space="preserve">: Analysis code is openly available via GitHub (https://github.com/haruki00430/NDB_POFM) and Zenodo (https://doi.org/10.5281/zenodo.20827647).</w:t>
-      </w:r>
-    </w:p>
-    <w:bookmarkEnd w:id="12"/>
-    <w:bookmarkStart w:id="13" w:name="declarations"/>
-    <w:p>
-      <w:pPr>
-        <w:pStyle w:val="Heading2"/>
-      </w:pPr>
-      <w:r>
-        <w:t xml:space="preserve">Declarations</w:t>
+        <w:t>Transparent and open science</w:t>
+      </w:r>
+      <w:r>
+        <w:t>: Analysis code is openly available via GitHub (https://github.com/haruki00430/NDB_POFM) and Zenodo (https://doi.org/10.5281/zenodo.20827647).</w:t>
+      </w:r>
+    </w:p>
+    <w:p>
+      <w:pPr>
+        <w:pStyle w:val="2"/>
+      </w:pPr>
+      <w:bookmarkStart w:id="5" w:name="declarations"/>
+      <w:bookmarkEnd w:id="4"/>
+      <w:r>
+        <w:t>Declarations</w:t>
       </w:r>
     </w:p>
     <w:p>
@@ -526,7 +466,7 @@
         <w:pStyle w:val="Compact"/>
         <w:numPr>
           <w:ilvl w:val="0"/>
-          <w:numId w:val="1004"/>
+          <w:numId w:val="5"/>
         </w:numPr>
       </w:pPr>
       <w:r>
@@ -534,26 +474,20 @@
           <w:b/>
           <w:bCs/>
         </w:rPr>
-        <w:t xml:space="preserve">Previous submission</w:t>
-      </w:r>
-      <w:r>
-        <w:t xml:space="preserve">: Previously submitted to</w:t>
-      </w:r>
-      <w:r>
-        <w:t xml:space="preserve"> </w:t>
+        <w:t>Previous submission</w:t>
+      </w:r>
+      <w:r>
+        <w:t xml:space="preserve">: Previously submitted to </w:t>
       </w:r>
       <w:r>
         <w:rPr>
           <w:i/>
           <w:iCs/>
         </w:rPr>
-        <w:t xml:space="preserve">Health Policy</w:t>
-      </w:r>
-      <w:r>
-        <w:t xml:space="preserve"> </w:t>
-      </w:r>
-      <w:r>
-        <w:t xml:space="preserve">(Elsevier; HEAP-D-26-01327); desk rejected 24 June 2026 without peer review. Elsevier’s automated transfer recommendation was declined. Not submitted elsewhere.</w:t>
+        <w:t>Health Policy</w:t>
+      </w:r>
+      <w:r>
+        <w:t xml:space="preserve"> (Elsevier; HEAP-D-26-01327); desk rejected 24 June 2026 without peer review. Elsevier’s automated transfer recommendation was declined. Not submitted elsewhere.</w:t>
       </w:r>
     </w:p>
     <w:p>
@@ -561,7 +495,7 @@
         <w:pStyle w:val="Compact"/>
         <w:numPr>
           <w:ilvl w:val="0"/>
-          <w:numId w:val="1004"/>
+          <w:numId w:val="5"/>
         </w:numPr>
       </w:pPr>
       <w:r>
@@ -569,10 +503,10 @@
           <w:b/>
           <w:bCs/>
         </w:rPr>
-        <w:t xml:space="preserve">Ethics</w:t>
-      </w:r>
-      <w:r>
-        <w:t xml:space="preserve">: This study used publicly available aggregate data (NDB Open Data, published by the Ministry of Health, Labour and Welfare of Japan). Individual informed consent and institutional ethics review were not required under Japanese ethical guidelines for epidemiological research using publicly disclosed aggregate statistics (Ethical Guidelines for Medical and Health Research Involving Human Subjects, Ministry of Health, Labour and Welfare, Japan).</w:t>
+        <w:t>Ethics</w:t>
+      </w:r>
+      <w:r>
+        <w:t>: This study used publicly available aggregate data (NDB Open Data, published by the Ministry of Health, Labour and Welfare of Japan). Individual informed consent and institutional ethics review were not required under Japanese ethical guidelines for epidemiological research using publicly disclosed aggregate statistics (Ethical Guidelines for Medical and Health Research Involving Human Subjects, Ministry of Health, Labour and Welfare, Japan).</w:t>
       </w:r>
     </w:p>
     <w:p>
@@ -580,7 +514,7 @@
         <w:pStyle w:val="Compact"/>
         <w:numPr>
           <w:ilvl w:val="0"/>
-          <w:numId w:val="1004"/>
+          <w:numId w:val="5"/>
         </w:numPr>
       </w:pPr>
       <w:r>
@@ -588,10 +522,10 @@
           <w:b/>
           <w:bCs/>
         </w:rPr>
-        <w:t xml:space="preserve">Data availability</w:t>
-      </w:r>
-      <w:r>
-        <w:t xml:space="preserve">: NDB Open Data are publicly available from the Ministry of Health, Labour and Welfare of Japan (https://www.mhlw.go.jp/stf/seisakunitsuite/bunya/0000177182.html). Analysis code is available at https://github.com/haruki00430/NDB_POFM and archived on Zenodo (https://doi.org/10.5281/zenodo.20827647).</w:t>
+        <w:t>Data availability</w:t>
+      </w:r>
+      <w:r>
+        <w:t>: NDB Open Data are publicly available from the Ministry of Health, Labour and Welfare of Japan (https://www.mhlw.go.jp/stf/seisakunitsuite/bunya/0000177182.html). Analysis code is available at https://github.com/haruki00430/NDB_POFM and archived on Zenodo (https://doi.org/10.5281/zenodo.20827647).</w:t>
       </w:r>
     </w:p>
     <w:p>
@@ -599,7 +533,7 @@
         <w:pStyle w:val="Compact"/>
         <w:numPr>
           <w:ilvl w:val="0"/>
-          <w:numId w:val="1004"/>
+          <w:numId w:val="5"/>
         </w:numPr>
       </w:pPr>
       <w:r>
@@ -607,10 +541,10 @@
           <w:b/>
           <w:bCs/>
         </w:rPr>
-        <w:t xml:space="preserve">Conflicts of interest</w:t>
-      </w:r>
-      <w:r>
-        <w:t xml:space="preserve">: The authors declare no conflicts of interest.</w:t>
+        <w:t>Conflicts of interest</w:t>
+      </w:r>
+      <w:r>
+        <w:t>: The authors declare no conflicts of interest.</w:t>
       </w:r>
     </w:p>
     <w:p>
@@ -618,7 +552,7 @@
         <w:pStyle w:val="Compact"/>
         <w:numPr>
           <w:ilvl w:val="0"/>
-          <w:numId w:val="1004"/>
+          <w:numId w:val="5"/>
         </w:numPr>
       </w:pPr>
       <w:r>
@@ -626,10 +560,10 @@
           <w:b/>
           <w:bCs/>
         </w:rPr>
-        <w:t xml:space="preserve">Funding</w:t>
-      </w:r>
-      <w:r>
-        <w:t xml:space="preserve">: None declared.</w:t>
+        <w:t>Funding</w:t>
+      </w:r>
+      <w:r>
+        <w:t>: None declared.</w:t>
       </w:r>
     </w:p>
     <w:p>
@@ -637,7 +571,7 @@
         <w:pStyle w:val="Compact"/>
         <w:numPr>
           <w:ilvl w:val="0"/>
-          <w:numId w:val="1004"/>
+          <w:numId w:val="5"/>
         </w:numPr>
       </w:pPr>
       <w:r>
@@ -645,10 +579,14 @@
           <w:b/>
           <w:bCs/>
         </w:rPr>
-        <w:t xml:space="preserve">AI use disclosure</w:t>
-      </w:r>
-      <w:r>
-        <w:t xml:space="preserve">: AI-assisted tools were used to support statistical analysis scripting and manuscript drafting. Development platforms included Cursor 3.0 (Anysphere) and Google Antigravity (Google), employing large language models including Claude Sonnet 4.6 and Claude Opus 4.8 (Anthropic), GPT-5.5 (OpenAI), and Gemini 3 Pro (Google). These tools were used exclusively for code generation and text drafting; no AI was used to create, alter, or process any figures, images, or artwork. All study design decisions, selection of statistical methods, interpretation of findings, and conclusions are the sole responsibility of the authors.</w:t>
+        <w:t>AI use disclosure</w:t>
+      </w:r>
+      <w:r>
+        <w:t xml:space="preserve">: AI-assisted tools were used to support statistical analysis scripting and manuscript drafting. Development platforms included Cursor 3.0 (Anysphere) and Google Antigravity (Google), employing large language models including Claude Sonnet 4.6 and Claude Opus 4.8 (Anthropic), GPT-5.5 (OpenAI), and Gemini 3 Pro (Google). These tools were used exclusively for code generation and text drafting; no AI was used to create, alter, or process any figures, images, or artwork. All study design decisions, selection of </w:t>
+      </w:r>
+      <w:r>
+        <w:lastRenderedPageBreak/>
+        <w:t>statistical methods, interpretation of findings, and conclusions are the sole responsibility of the authors.</w:t>
       </w:r>
     </w:p>
     <w:p>
@@ -656,7 +594,7 @@
         <w:pStyle w:val="Compact"/>
         <w:numPr>
           <w:ilvl w:val="0"/>
-          <w:numId w:val="1004"/>
+          <w:numId w:val="5"/>
         </w:numPr>
       </w:pPr>
       <w:r>
@@ -664,10 +602,10 @@
           <w:b/>
           <w:bCs/>
         </w:rPr>
-        <w:t xml:space="preserve">Reporting guideline</w:t>
-      </w:r>
-      <w:r>
-        <w:t xml:space="preserve">: A completed STROBE checklist for observational research is submitted as a supplementary file.</w:t>
+        <w:t>Reporting guideline</w:t>
+      </w:r>
+      <w:r>
+        <w:t>: A completed STROBE checklist for observational research is submitted as a supplementary file.</w:t>
       </w:r>
     </w:p>
     <w:p>
@@ -675,7 +613,7 @@
         <w:pStyle w:val="Compact"/>
         <w:numPr>
           <w:ilvl w:val="0"/>
-          <w:numId w:val="1004"/>
+          <w:numId w:val="5"/>
         </w:numPr>
       </w:pPr>
       <w:r>
@@ -683,10 +621,10 @@
           <w:b/>
           <w:bCs/>
         </w:rPr>
-        <w:t xml:space="preserve">Word count</w:t>
-      </w:r>
-      <w:r>
-        <w:t xml:space="preserve">: Approximately 2,325 words (body text, excluding Abstract, References, Tables, and Figure legends), well within the journal’s 5,000-word limit.</w:t>
+        <w:t>Word count</w:t>
+      </w:r>
+      <w:r>
+        <w:t>: Approximately 2,325 words (body text, excluding Abstract, References, Tables, and Figure legends), well within the journal’s 5,000-word limit.</w:t>
       </w:r>
     </w:p>
     <w:p>
@@ -694,7 +632,7 @@
         <w:pStyle w:val="Compact"/>
         <w:numPr>
           <w:ilvl w:val="0"/>
-          <w:numId w:val="1004"/>
+          <w:numId w:val="5"/>
         </w:numPr>
       </w:pPr>
       <w:r>
@@ -702,10 +640,10 @@
           <w:b/>
           <w:bCs/>
         </w:rPr>
-        <w:t xml:space="preserve">Figures and Tables</w:t>
-      </w:r>
-      <w:r>
-        <w:t xml:space="preserve">: 4 items in the main body (Table 1, Table 2, Figure 1, Figure 2). Supplementary material (submitted as a single file) contains Appendix Figures A1–A4, Supplementary Figure S1, and Supplementary Table S1.</w:t>
+        <w:t>Figures and Tables</w:t>
+      </w:r>
+      <w:r>
+        <w:t>: 4 items in the main body (Table 1, Table 2, Figure 1, Figure 2). Supplementary material (submitted as a single file) contains Appendix Figures A1–A4, Supplementary Figure S1, and Supplementary Table S1.</w:t>
       </w:r>
     </w:p>
     <w:p>
@@ -713,76 +651,65 @@
         <w:pStyle w:val="FirstParagraph"/>
       </w:pPr>
       <w:r>
-        <w:t xml:space="preserve">We believe this study makes a timely and relevant contribution to the evaluation of clinical practice implementation under universal coverage, and we hope it will be of interest to readers of</w:t>
-      </w:r>
-      <w:r>
-        <w:t xml:space="preserve"> </w:t>
+        <w:t xml:space="preserve">We believe this study makes a timely and relevant contribution to the evaluation of clinical practice implementation under universal coverage, and we hope it will be of interest to readers of </w:t>
       </w:r>
       <w:r>
         <w:rPr>
           <w:i/>
           <w:iCs/>
         </w:rPr>
-        <w:t xml:space="preserve">Journal of Evaluation in Clinical Practice</w:t>
-      </w:r>
-      <w:r>
-        <w:t xml:space="preserve">. We look forward to your consideration.</w:t>
-      </w:r>
-    </w:p>
-    <w:p>
-      <w:pPr>
-        <w:pStyle w:val="BodyText"/>
-      </w:pPr>
-      <w:r>
-        <w:t xml:space="preserve">Yours sincerely,</w:t>
-      </w:r>
-    </w:p>
-    <w:p>
-      <w:pPr>
-        <w:pStyle w:val="BodyText"/>
+        <w:t>Journal of Evaluation in Clinical Practice</w:t>
+      </w:r>
+      <w:r>
+        <w:t>. We look forward to your consideration.</w:t>
+      </w:r>
+    </w:p>
+    <w:p>
+      <w:pPr>
+        <w:pStyle w:val="a0"/>
+      </w:pPr>
+      <w:r>
+        <w:t>Yours sincerely,</w:t>
+      </w:r>
+    </w:p>
+    <w:p>
+      <w:pPr>
+        <w:pStyle w:val="a0"/>
       </w:pPr>
       <w:r>
         <w:rPr>
           <w:b/>
           <w:bCs/>
         </w:rPr>
-        <w:t xml:space="preserve">Haruki Saito, MD</w:t>
+        <w:t>Haruki Saito</w:t>
       </w:r>
       <w:r>
         <w:br/>
-      </w:r>
-      <w:r>
-        <w:t xml:space="preserve">Department of Epidemiology, Fukushima Medical University School of Medicine</w:t>
+        <w:t>Department of Epidemiology, Fukushima Medical University School of Medicine</w:t>
       </w:r>
       <w:r>
         <w:br/>
-      </w:r>
-      <w:r>
-        <w:t xml:space="preserve">1 Hikarigaoka, Fukushima-shi, Fukushima 960-1295, Japan</w:t>
+        <w:t>1 Hikarigaoka, Fukushima-shi, Fukushima 960-1295, Japan</w:t>
       </w:r>
       <w:r>
         <w:br/>
-      </w:r>
-      <w:r>
-        <w:t xml:space="preserve">Email: m211039@fmu.ac.jp</w:t>
+        <w:t>Email: m211039@fmu.ac.jp</w:t>
       </w:r>
       <w:r>
         <w:br/>
-      </w:r>
-      <w:r>
-        <w:t xml:space="preserve">ORCID: 0009-0009-7890-6068</w:t>
-      </w:r>
-    </w:p>
-    <w:p>
-      <w:pPr>
-        <w:pStyle w:val="BodyText"/>
+        <w:t>ORCID: 0009-0009-7890-6068</w:t>
+      </w:r>
+    </w:p>
+    <w:p>
+      <w:pPr>
+        <w:pStyle w:val="a0"/>
       </w:pPr>
       <w:r>
         <w:rPr>
           <w:i/>
           <w:iCs/>
         </w:rPr>
-        <w:t xml:space="preserve">On behalf of all co-authors:</w:t>
+        <w:t>On behalf of all co-authors:</w:t>
       </w:r>
       <w:r>
         <w:br/>
@@ -792,7 +719,7 @@
           <w:i/>
           <w:iCs/>
         </w:rPr>
-        <w:t xml:space="preserve">Tetsuya Ohira¹², ORCID: 0000-0003-4532-7165</w:t>
+        <w:t>Tetsuya Ohira¹², ORCID: 0000-0003-4532-7165</w:t>
       </w:r>
       <w:r>
         <w:br/>
@@ -802,7 +729,7 @@
           <w:i/>
           <w:iCs/>
         </w:rPr>
-        <w:t xml:space="preserve">¹ Department of Epidemiology, Fukushima Medical University School of Medicine, Fukushima, Japan</w:t>
+        <w:t>¹ Department of Epidemiology, Fukushima Medical University School of Medicine, Fukushima, Japan</w:t>
       </w:r>
       <w:r>
         <w:br/>
@@ -812,13 +739,13 @@
           <w:i/>
           <w:iCs/>
         </w:rPr>
-        <w:t xml:space="preserve">² Radiation Medical Science Center for the Fukushima Health Management Survey, Fukushima Medical University, Fukushima, Japan</w:t>
-      </w:r>
-    </w:p>
-    <w:p>
-      <w:r>
-        <w:pict>
-          <v:rect style="width:0;height:1.5pt" o:hralign="center" o:hrstd="t" o:hr="t"/>
+        <w:t>² Radiation Medical Science Center for the Fukushima Health Management Survey, Fukushima Medical University, Fukushima, Japan</w:t>
+      </w:r>
+    </w:p>
+    <w:p>
+      <w:r>
+        <w:pict w14:anchorId="287C9965">
+          <v:rect id="_x0000_i1027" style="width:0;height:1.5pt" o:hralign="center" o:hrstd="t" o:hr="t"/>
         </w:pict>
       </w:r>
     </w:p>
@@ -831,48 +758,29 @@
           <w:i/>
           <w:iCs/>
         </w:rPr>
-        <w:t xml:space="preserve">Corresponding author for all correspondence regarding this manuscript.</w:t>
-      </w:r>
-    </w:p>
-    <w:bookmarkEnd w:id="13"/>
-    <w:bookmarkEnd w:id="14"/>
+        <w:t>Corresponding author for all correspondence regarding this manuscript.</w:t>
+      </w:r>
+      <w:bookmarkEnd w:id="0"/>
+      <w:bookmarkEnd w:id="5"/>
+    </w:p>
     <w:sectPr>
       <w:footnotePr>
         <w:numRestart w:val="eachSect"/>
       </w:footnotePr>
+      <w:pgSz w:w="12240" w:h="15840"/>
+      <w:pgMar w:top="1985" w:right="1701" w:bottom="1701" w:left="1701" w:header="720" w:footer="720" w:gutter="0"/>
+      <w:cols w:space="720"/>
     </w:sectPr>
   </w:body>
 </w:document>
 </file>
 
-<file path=word/comments.xml><?xml version="1.0" encoding="utf-8"?>
-<w:comments xmlns:w="http://schemas.openxmlformats.org/wordprocessingml/2006/main" xmlns:m="http://schemas.openxmlformats.org/officeDocument/2006/math" xmlns:r="http://schemas.openxmlformats.org/officeDocument/2006/relationships" xmlns:o="urn:schemas-microsoft-com:office:office" xmlns:v="urn:schemas-microsoft-com:vml" xmlns:w10="urn:schemas-microsoft-com:office:word" xmlns:a="http://schemas.openxmlformats.org/drawingml/2006/main" xmlns:pic="http://schemas.openxmlformats.org/drawingml/2006/picture" xmlns:wp="http://schemas.openxmlformats.org/drawingml/2006/wordprocessingDrawing"/>
-</file>
-
-<file path=word/footnotes.xml><?xml version="1.0" encoding="utf-8"?>
-<w:footnotes xmlns:w="http://schemas.openxmlformats.org/wordprocessingml/2006/main" xmlns:m="http://schemas.openxmlformats.org/officeDocument/2006/math" xmlns:r="http://schemas.openxmlformats.org/officeDocument/2006/relationships" xmlns:o="urn:schemas-microsoft-com:office:office" xmlns:v="urn:schemas-microsoft-com:vml" xmlns:w10="urn:schemas-microsoft-com:office:word" xmlns:a="http://schemas.openxmlformats.org/drawingml/2006/main" xmlns:pic="http://schemas.openxmlformats.org/drawingml/2006/picture" xmlns:wp="http://schemas.openxmlformats.org/drawingml/2006/wordprocessingDrawing">
-  <w:footnote w:type="continuationSeparator" w:id="0">
-    <w:p>
-      <w:r>
-        <w:continuationSeparator/>
-      </w:r>
-    </w:p>
-  </w:footnote>
-  <w:footnote w:type="separator" w:id="-1">
-    <w:p>
-      <w:r>
-        <w:separator/>
-      </w:r>
-    </w:p>
-  </w:footnote>
-</w:footnotes>
-</file>
-
 <file path=word/numbering.xml><?xml version="1.0" encoding="utf-8"?>
-<w:numbering xmlns:w="http://schemas.openxmlformats.org/wordprocessingml/2006/main">
-  <w:abstractNum w:abstractNumId="990">
+<w:numbering xmlns:wpc="http://schemas.microsoft.com/office/word/2010/wordprocessingCanvas" xmlns:cx="http://schemas.microsoft.com/office/drawing/2014/chartex" xmlns:cx1="http://schemas.microsoft.com/office/drawing/2015/9/8/chartex" xmlns:cx2="http://schemas.microsoft.com/office/drawing/2015/10/21/chartex" xmlns:cx3="http://schemas.microsoft.com/office/drawing/2016/5/9/chartex" xmlns:cx4="http://schemas.microsoft.com/office/drawing/2016/5/10/chartex" xmlns:cx5="http://schemas.microsoft.com/office/drawing/2016/5/11/chartex" xmlns:cx6="http://schemas.microsoft.com/office/drawing/2016/5/12/chartex" xmlns:cx7="http://schemas.microsoft.com/office/drawing/2016/5/13/chartex" xmlns:cx8="http://schemas.microsoft.com/office/drawing/2016/5/14/chartex" xmlns:mc="http://schemas.openxmlformats.org/markup-compatibility/2006" xmlns:aink="http://schemas.microsoft.com/office/drawing/2016/ink" xmlns:am3d="http://schemas.microsoft.com/office/drawing/2017/model3d" xmlns:o="urn:schemas-microsoft-com:office:office" xmlns:oel="http://schemas.microsoft.com/office/2019/extlst" xmlns:r="http://schemas.openxmlformats.org/officeDocument/2006/relationships" xmlns:m="http://schemas.openxmlformats.org/officeDocument/2006/math" xmlns:v="urn:schemas-microsoft-com:vml" xmlns:wp14="http://schemas.microsoft.com/office/word/2010/wordprocessingDrawing" xmlns:wp="http://schemas.openxmlformats.org/drawingml/2006/wordprocessingDrawing" xmlns:w10="urn:schemas-microsoft-com:office:word" xmlns:w="http://schemas.openxmlformats.org/wordprocessingml/2006/main" xmlns:w14="http://schemas.microsoft.com/office/word/2010/wordml" xmlns:w15="http://schemas.microsoft.com/office/word/2012/wordml" xmlns:w16cex="http://schemas.microsoft.com/office/word/2018/wordml/cex" xmlns:w16cid="http://schemas.microsoft.com/office/word/2016/wordml/cid" xmlns:w16="http://schemas.microsoft.com/office/word/2018/wordml" xmlns:w16du="http://schemas.microsoft.com/office/word/2023/wordml/word16du" xmlns:w16sdtdh="http://schemas.microsoft.com/office/word/2020/wordml/sdtdatahash" xmlns:w16sdtfl="http://schemas.microsoft.com/office/word/2024/wordml/sdtformatlock" xmlns:w16se="http://schemas.microsoft.com/office/word/2015/wordml/symex" xmlns:wpg="http://schemas.microsoft.com/office/word/2010/wordprocessingGroup" xmlns:wpi="http://schemas.microsoft.com/office/word/2010/wordprocessingInk" xmlns:wne="http://schemas.microsoft.com/office/word/2006/wordml" xmlns:wps="http://schemas.microsoft.com/office/word/2010/wordprocessingShape" mc:Ignorable="w14 w15 w16se w16cid w16 w16cex w16sdtdh w16sdtfl w16du wp14">
+  <w:abstractNum w:abstractNumId="0" w15:restartNumberingAfterBreak="0">
     <w:nsid w:val="0000A990"/>
     <w:multiLevelType w:val="multilevel"/>
+    <w:tmpl w:val="CDDAA14C"/>
     <w:lvl w:ilvl="0">
       <w:numFmt w:val="bullet"/>
       <w:lvlText w:val=" "/>
@@ -946,9 +854,10 @@
       </w:pPr>
     </w:lvl>
   </w:abstractNum>
-  <w:abstractNum w:abstractNumId="991">
+  <w:abstractNum w:abstractNumId="1" w15:restartNumberingAfterBreak="0">
     <w:nsid w:val="0000A991"/>
     <w:multiLevelType w:val="multilevel"/>
+    <w:tmpl w:val="E9CE4ACC"/>
     <w:lvl w:ilvl="0">
       <w:numFmt w:val="bullet"/>
       <w:lvlText w:val=""/>
@@ -1049,9 +958,10 @@
       </w:rPr>
     </w:lvl>
   </w:abstractNum>
-  <w:abstractNum w:abstractNumId="99411">
+  <w:abstractNum w:abstractNumId="2" w15:restartNumberingAfterBreak="0">
     <w:nsid w:val="00A99411"/>
     <w:multiLevelType w:val="multilevel"/>
+    <w:tmpl w:val="0870333E"/>
     <w:lvl w:ilvl="0">
       <w:start w:val="1"/>
       <w:numFmt w:val="decimal"/>
@@ -1134,14 +1044,14 @@
       </w:pPr>
     </w:lvl>
   </w:abstractNum>
-  <w:num w:numId="1000">
-    <w:abstractNumId w:val="990"/>
+  <w:num w:numId="1" w16cid:durableId="1389105479">
+    <w:abstractNumId w:val="0"/>
   </w:num>
-  <w:num w:numId="1001">
-    <w:abstractNumId w:val="991"/>
+  <w:num w:numId="2" w16cid:durableId="499662456">
+    <w:abstractNumId w:val="1"/>
   </w:num>
-  <w:num w:numId="1002">
-    <w:abstractNumId w:val="99411"/>
+  <w:num w:numId="3" w16cid:durableId="1423256189">
+    <w:abstractNumId w:val="2"/>
     <w:lvlOverride w:ilvl="0">
       <w:startOverride w:val="1"/>
     </w:lvlOverride>
@@ -1170,24 +1080,24 @@
       <w:startOverride w:val="1"/>
     </w:lvlOverride>
   </w:num>
-  <w:num w:numId="1003">
-    <w:abstractNumId w:val="991"/>
+  <w:num w:numId="4" w16cid:durableId="1600719555">
+    <w:abstractNumId w:val="1"/>
   </w:num>
-  <w:num w:numId="1004">
-    <w:abstractNumId w:val="991"/>
+  <w:num w:numId="5" w16cid:durableId="1538277965">
+    <w:abstractNumId w:val="1"/>
   </w:num>
 </w:numbering>
 </file>
 
 <file path=word/styles.xml><?xml version="1.0" encoding="utf-8"?>
-<w:styles xmlns:r="http://schemas.openxmlformats.org/officeDocument/2006/relationships" xmlns:w="http://schemas.openxmlformats.org/wordprocessingml/2006/main">
+<w:styles xmlns:mc="http://schemas.openxmlformats.org/markup-compatibility/2006" xmlns:r="http://schemas.openxmlformats.org/officeDocument/2006/relationships" xmlns:w="http://schemas.openxmlformats.org/wordprocessingml/2006/main" xmlns:w14="http://schemas.microsoft.com/office/word/2010/wordml" xmlns:w15="http://schemas.microsoft.com/office/word/2012/wordml" xmlns:w16cex="http://schemas.microsoft.com/office/word/2018/wordml/cex" xmlns:w16cid="http://schemas.microsoft.com/office/word/2016/wordml/cid" xmlns:w16="http://schemas.microsoft.com/office/word/2018/wordml" xmlns:w16du="http://schemas.microsoft.com/office/word/2023/wordml/word16du" xmlns:w16sdtdh="http://schemas.microsoft.com/office/word/2020/wordml/sdtdatahash" xmlns:w16sdtfl="http://schemas.microsoft.com/office/word/2024/wordml/sdtformatlock" xmlns:w16se="http://schemas.microsoft.com/office/word/2015/wordml/symex" mc:Ignorable="w14 w15 w16se w16cid w16 w16cex w16sdtdh w16sdtfl w16du">
   <w:docDefaults>
     <w:rPrDefault>
       <w:rPr>
-        <w:rFonts w:asciiTheme="minorHAnsi" w:cstheme="minorBidi" w:eastAsiaTheme="minorEastAsia" w:hAnsiTheme="minorHAnsi"/>
+        <w:rFonts w:asciiTheme="minorHAnsi" w:eastAsiaTheme="minorEastAsia" w:hAnsiTheme="minorHAnsi" w:cstheme="minorBidi"/>
         <w:sz w:val="24"/>
         <w:szCs w:val="24"/>
-        <w:lang w:bidi="ar-SA" w:eastAsia="zh-CN" w:val="en-US"/>
+        <w:lang w:val="en-US" w:eastAsia="zh-CN" w:bidi="ar-SA"/>
       </w:rPr>
     </w:rPrDefault>
     <w:pPrDefault>
@@ -1196,193 +1106,280 @@
       </w:pPr>
     </w:pPrDefault>
   </w:docDefaults>
-  <w:latentStyles w:count="276" w:defLockedState="0" w:defQFormat="0" w:defSemiHidden="0" w:defUIPriority="0" w:defUnhideWhenUsed="0"/>
-  <w:style w:default="1" w:styleId="Normal" w:type="paragraph">
+  <w:latentStyles w:defLockedState="0" w:defUIPriority="0" w:defSemiHidden="0" w:defUnhideWhenUsed="0" w:defQFormat="0" w:count="376">
+    <w:lsdException w:name="Normal Table" w:semiHidden="1" w:unhideWhenUsed="1"/>
+    <w:lsdException w:name="Table Simple 1" w:semiHidden="1" w:unhideWhenUsed="1"/>
+    <w:lsdException w:name="Table Simple 2" w:semiHidden="1" w:unhideWhenUsed="1"/>
+    <w:lsdException w:name="Table Simple 3" w:semiHidden="1" w:unhideWhenUsed="1"/>
+    <w:lsdException w:name="Table Classic 1" w:semiHidden="1" w:unhideWhenUsed="1"/>
+    <w:lsdException w:name="Table Classic 2" w:semiHidden="1" w:unhideWhenUsed="1"/>
+    <w:lsdException w:name="Table Classic 3" w:semiHidden="1" w:unhideWhenUsed="1"/>
+    <w:lsdException w:name="Table Classic 4" w:semiHidden="1" w:unhideWhenUsed="1"/>
+    <w:lsdException w:name="Table Colorful 1" w:semiHidden="1" w:unhideWhenUsed="1"/>
+    <w:lsdException w:name="Table Colorful 2" w:semiHidden="1" w:unhideWhenUsed="1"/>
+    <w:lsdException w:name="Table Colorful 3" w:semiHidden="1" w:unhideWhenUsed="1"/>
+    <w:lsdException w:name="Table Columns 1" w:semiHidden="1" w:unhideWhenUsed="1"/>
+    <w:lsdException w:name="Table Columns 2" w:semiHidden="1" w:unhideWhenUsed="1"/>
+    <w:lsdException w:name="Table Columns 3" w:semiHidden="1" w:unhideWhenUsed="1"/>
+    <w:lsdException w:name="Table Columns 4" w:semiHidden="1" w:unhideWhenUsed="1"/>
+    <w:lsdException w:name="Table Columns 5" w:semiHidden="1" w:unhideWhenUsed="1"/>
+    <w:lsdException w:name="Table Grid 1" w:semiHidden="1" w:unhideWhenUsed="1"/>
+    <w:lsdException w:name="Table Grid 2" w:semiHidden="1" w:unhideWhenUsed="1"/>
+    <w:lsdException w:name="Table Grid 3" w:semiHidden="1" w:unhideWhenUsed="1"/>
+    <w:lsdException w:name="Table Grid 4" w:semiHidden="1" w:unhideWhenUsed="1"/>
+    <w:lsdException w:name="Table Grid 5" w:semiHidden="1" w:unhideWhenUsed="1"/>
+    <w:lsdException w:name="Table Grid 6" w:semiHidden="1" w:unhideWhenUsed="1"/>
+    <w:lsdException w:name="Table Grid 7" w:semiHidden="1" w:unhideWhenUsed="1"/>
+    <w:lsdException w:name="Table Grid 8" w:semiHidden="1" w:unhideWhenUsed="1"/>
+    <w:lsdException w:name="Table List 1" w:semiHidden="1" w:unhideWhenUsed="1"/>
+    <w:lsdException w:name="Table List 2" w:semiHidden="1" w:unhideWhenUsed="1"/>
+    <w:lsdException w:name="Table List 3" w:semiHidden="1" w:unhideWhenUsed="1"/>
+    <w:lsdException w:name="Table List 4" w:semiHidden="1" w:unhideWhenUsed="1"/>
+    <w:lsdException w:name="Table List 5" w:semiHidden="1" w:unhideWhenUsed="1"/>
+    <w:lsdException w:name="Table List 6" w:semiHidden="1" w:unhideWhenUsed="1"/>
+    <w:lsdException w:name="Table List 7" w:semiHidden="1" w:unhideWhenUsed="1"/>
+    <w:lsdException w:name="Table List 8" w:semiHidden="1" w:unhideWhenUsed="1"/>
+    <w:lsdException w:name="Table 3D effects 1" w:semiHidden="1" w:unhideWhenUsed="1"/>
+    <w:lsdException w:name="Table 3D effects 2" w:semiHidden="1" w:unhideWhenUsed="1"/>
+    <w:lsdException w:name="Table 3D effects 3" w:semiHidden="1" w:unhideWhenUsed="1"/>
+    <w:lsdException w:name="Table Contemporary" w:semiHidden="1" w:unhideWhenUsed="1"/>
+    <w:lsdException w:name="Table Elegant" w:semiHidden="1" w:unhideWhenUsed="1"/>
+    <w:lsdException w:name="Table Professional" w:semiHidden="1" w:unhideWhenUsed="1"/>
+    <w:lsdException w:name="Table Subtle 1" w:semiHidden="1" w:unhideWhenUsed="1"/>
+    <w:lsdException w:name="Table Subtle 2" w:semiHidden="1" w:unhideWhenUsed="1"/>
+    <w:lsdException w:name="Table Web 1" w:semiHidden="1" w:unhideWhenUsed="1"/>
+    <w:lsdException w:name="Table Web 2" w:semiHidden="1" w:unhideWhenUsed="1"/>
+    <w:lsdException w:name="Table Web 3" w:semiHidden="1" w:unhideWhenUsed="1"/>
+    <w:lsdException w:name="Table Theme" w:semiHidden="1" w:unhideWhenUsed="1"/>
+    <w:lsdException w:name="Light Shading"/>
+    <w:lsdException w:name="Light List"/>
+    <w:lsdException w:name="Light Grid"/>
+    <w:lsdException w:name="Medium Shading 1"/>
+    <w:lsdException w:name="Medium Shading 2"/>
+    <w:lsdException w:name="Medium List 1"/>
+    <w:lsdException w:name="Medium List 2"/>
+    <w:lsdException w:name="Medium Grid 1"/>
+    <w:lsdException w:name="Medium Grid 2"/>
+    <w:lsdException w:name="Medium Grid 3"/>
+    <w:lsdException w:name="Dark List"/>
+    <w:lsdException w:name="Colorful Shading"/>
+    <w:lsdException w:name="Colorful List"/>
+    <w:lsdException w:name="Colorful Grid"/>
+    <w:lsdException w:name="Light Shading Accent 1"/>
+    <w:lsdException w:name="Light List Accent 1"/>
+    <w:lsdException w:name="Light Grid Accent 1"/>
+    <w:lsdException w:name="Medium Shading 1 Accent 1"/>
+    <w:lsdException w:name="Medium Shading 2 Accent 1"/>
+    <w:lsdException w:name="Medium List 1 Accent 1"/>
+    <w:lsdException w:name="Medium List 2 Accent 1"/>
+    <w:lsdException w:name="Medium Grid 1 Accent 1"/>
+    <w:lsdException w:name="Medium Grid 2 Accent 1"/>
+    <w:lsdException w:name="Medium Grid 3 Accent 1"/>
+    <w:lsdException w:name="Dark List Accent 1"/>
+    <w:lsdException w:name="Colorful Shading Accent 1"/>
+    <w:lsdException w:name="Colorful List Accent 1"/>
+    <w:lsdException w:name="Colorful Grid Accent 1"/>
+    <w:lsdException w:name="Light Shading Accent 2"/>
+    <w:lsdException w:name="Light List Accent 2"/>
+    <w:lsdException w:name="Light Grid Accent 2"/>
+    <w:lsdException w:name="Medium Shading 1 Accent 2"/>
+    <w:lsdException w:name="Medium Shading 2 Accent 2"/>
+    <w:lsdException w:name="Medium List 1 Accent 2"/>
+    <w:lsdException w:name="Medium List 2 Accent 2"/>
+    <w:lsdException w:name="Medium Grid 1 Accent 2"/>
+    <w:lsdException w:name="Medium Grid 2 Accent 2"/>
+    <w:lsdException w:name="Medium Grid 3 Accent 2"/>
+    <w:lsdException w:name="Dark List Accent 2"/>
+    <w:lsdException w:name="Colorful Shading Accent 2"/>
+    <w:lsdException w:name="Colorful List Accent 2"/>
+    <w:lsdException w:name="Colorful Grid Accent 2"/>
+    <w:lsdException w:name="Light Shading Accent 3"/>
+    <w:lsdException w:name="Light List Accent 3"/>
+    <w:lsdException w:name="Light Grid Accent 3"/>
+    <w:lsdException w:name="Medium Shading 1 Accent 3"/>
+    <w:lsdException w:name="Medium Shading 2 Accent 3"/>
+    <w:lsdException w:name="Medium List 1 Accent 3"/>
+    <w:lsdException w:name="Medium List 2 Accent 3"/>
+    <w:lsdException w:name="Medium Grid 1 Accent 3"/>
+    <w:lsdException w:name="Medium Grid 2 Accent 3"/>
+    <w:lsdException w:name="Medium Grid 3 Accent 3"/>
+    <w:lsdException w:name="Dark List Accent 3"/>
+    <w:lsdException w:name="Colorful Shading Accent 3"/>
+    <w:lsdException w:name="Colorful List Accent 3"/>
+    <w:lsdException w:name="Colorful Grid Accent 3"/>
+    <w:lsdException w:name="Light Shading Accent 4"/>
+    <w:lsdException w:name="Light List Accent 4"/>
+    <w:lsdException w:name="Light Grid Accent 4"/>
+    <w:lsdException w:name="Medium Shading 1 Accent 4"/>
+    <w:lsdException w:name="Medium Shading 2 Accent 4"/>
+    <w:lsdException w:name="Medium List 1 Accent 4"/>
+    <w:lsdException w:name="Medium List 2 Accent 4"/>
+    <w:lsdException w:name="Medium Grid 1 Accent 4"/>
+    <w:lsdException w:name="Medium Grid 2 Accent 4"/>
+    <w:lsdException w:name="Medium Grid 3 Accent 4"/>
+    <w:lsdException w:name="Dark List Accent 4"/>
+    <w:lsdException w:name="Colorful Shading Accent 4"/>
+    <w:lsdException w:name="Colorful List Accent 4"/>
+    <w:lsdException w:name="Colorful Grid Accent 4"/>
+    <w:lsdException w:name="Light Shading Accent 5"/>
+    <w:lsdException w:name="Light List Accent 5"/>
+    <w:lsdException w:name="Light Grid Accent 5"/>
+    <w:lsdException w:name="Medium Shading 1 Accent 5"/>
+    <w:lsdException w:name="Medium Shading 2 Accent 5"/>
+    <w:lsdException w:name="Medium List 1 Accent 5"/>
+    <w:lsdException w:name="Medium List 2 Accent 5"/>
+    <w:lsdException w:name="Medium Grid 1 Accent 5"/>
+    <w:lsdException w:name="Medium Grid 2 Accent 5"/>
+    <w:lsdException w:name="Medium Grid 3 Accent 5"/>
+    <w:lsdException w:name="Dark List Accent 5"/>
+    <w:lsdException w:name="Colorful Shading Accent 5"/>
+    <w:lsdException w:name="Colorful List Accent 5"/>
+    <w:lsdException w:name="Colorful Grid Accent 5"/>
+    <w:lsdException w:name="Light Shading Accent 6"/>
+    <w:lsdException w:name="Light List Accent 6"/>
+    <w:lsdException w:name="Light Grid Accent 6"/>
+    <w:lsdException w:name="Medium Shading 1 Accent 6"/>
+    <w:lsdException w:name="Medium Shading 2 Accent 6"/>
+    <w:lsdException w:name="Medium List 1 Accent 6"/>
+    <w:lsdException w:name="Medium List 2 Accent 6"/>
+    <w:lsdException w:name="Medium Grid 1 Accent 6"/>
+    <w:lsdException w:name="Medium Grid 2 Accent 6"/>
+    <w:lsdException w:name="Medium Grid 3 Accent 6"/>
+    <w:lsdException w:name="Dark List Accent 6"/>
+    <w:lsdException w:name="Colorful Shading Accent 6"/>
+    <w:lsdException w:name="Colorful List Accent 6"/>
+    <w:lsdException w:name="Colorful Grid Accent 6"/>
+    <w:lsdException w:name="Grid Table 4" w:uiPriority="49"/>
+    <w:lsdException w:name="Grid Table 5 Dark" w:uiPriority="50"/>
+    <w:lsdException w:name="Grid Table 6 Colorful" w:uiPriority="51"/>
+    <w:lsdException w:name="Grid Table 7 Colorful" w:uiPriority="52"/>
+    <w:lsdException w:name="Grid Table 1 Light Accent 1" w:uiPriority="46"/>
+    <w:lsdException w:name="Grid Table 2 Accent 1" w:uiPriority="47"/>
+    <w:lsdException w:name="Grid Table 3 Accent 1" w:uiPriority="48"/>
+    <w:lsdException w:name="Grid Table 4 Accent 1" w:uiPriority="49"/>
+    <w:lsdException w:name="Grid Table 5 Dark Accent 1" w:uiPriority="50"/>
+    <w:lsdException w:name="Grid Table 6 Colorful Accent 1" w:uiPriority="51"/>
+    <w:lsdException w:name="Grid Table 7 Colorful Accent 1" w:uiPriority="52"/>
+    <w:lsdException w:name="Grid Table 1 Light Accent 2" w:uiPriority="46"/>
+    <w:lsdException w:name="Grid Table 2 Accent 2" w:uiPriority="47"/>
+    <w:lsdException w:name="Grid Table 3 Accent 2" w:uiPriority="48"/>
+    <w:lsdException w:name="Grid Table 4 Accent 2" w:uiPriority="49"/>
+    <w:lsdException w:name="Grid Table 5 Dark Accent 2" w:uiPriority="50"/>
+    <w:lsdException w:name="Grid Table 6 Colorful Accent 2" w:uiPriority="51"/>
+    <w:lsdException w:name="Grid Table 7 Colorful Accent 2" w:uiPriority="52"/>
+    <w:lsdException w:name="Grid Table 1 Light Accent 3" w:uiPriority="46"/>
+    <w:lsdException w:name="Grid Table 2 Accent 3" w:uiPriority="47"/>
+    <w:lsdException w:name="Grid Table 3 Accent 3" w:uiPriority="48"/>
+    <w:lsdException w:name="Grid Table 4 Accent 3" w:uiPriority="49"/>
+    <w:lsdException w:name="Grid Table 5 Dark Accent 3" w:uiPriority="50"/>
+    <w:lsdException w:name="Grid Table 6 Colorful Accent 3" w:uiPriority="51"/>
+    <w:lsdException w:name="Grid Table 7 Colorful Accent 3" w:uiPriority="52"/>
+    <w:lsdException w:name="Grid Table 1 Light Accent 4" w:uiPriority="46"/>
+    <w:lsdException w:name="Grid Table 2 Accent 4" w:uiPriority="47"/>
+    <w:lsdException w:name="Grid Table 3 Accent 4" w:uiPriority="48"/>
+    <w:lsdException w:name="Grid Table 4 Accent 4" w:uiPriority="49"/>
+    <w:lsdException w:name="Grid Table 5 Dark Accent 4" w:uiPriority="50"/>
+    <w:lsdException w:name="Grid Table 6 Colorful Accent 4" w:uiPriority="51"/>
+    <w:lsdException w:name="Grid Table 7 Colorful Accent 4" w:uiPriority="52"/>
+    <w:lsdException w:name="Grid Table 1 Light Accent 5" w:uiPriority="46"/>
+    <w:lsdException w:name="Grid Table 2 Accent 5" w:uiPriority="47"/>
+    <w:lsdException w:name="Grid Table 3 Accent 5" w:uiPriority="48"/>
+    <w:lsdException w:name="Grid Table 4 Accent 5" w:uiPriority="49"/>
+    <w:lsdException w:name="Grid Table 5 Dark Accent 5" w:uiPriority="50"/>
+    <w:lsdException w:name="Grid Table 6 Colorful Accent 5" w:uiPriority="51"/>
+    <w:lsdException w:name="Grid Table 7 Colorful Accent 5" w:uiPriority="52"/>
+    <w:lsdException w:name="Grid Table 1 Light Accent 6" w:uiPriority="46"/>
+    <w:lsdException w:name="Grid Table 2 Accent 6" w:uiPriority="47"/>
+    <w:lsdException w:name="Grid Table 3 Accent 6" w:uiPriority="48"/>
+    <w:lsdException w:name="Grid Table 4 Accent 6" w:uiPriority="49"/>
+    <w:lsdException w:name="Grid Table 5 Dark Accent 6" w:uiPriority="50"/>
+    <w:lsdException w:name="Grid Table 6 Colorful Accent 6" w:uiPriority="51"/>
+    <w:lsdException w:name="Grid Table 7 Colorful Accent 6" w:uiPriority="52"/>
+    <w:lsdException w:name="List Table 1 Light" w:uiPriority="46"/>
+    <w:lsdException w:name="List Table 2" w:uiPriority="47"/>
+    <w:lsdException w:name="List Table 3" w:uiPriority="48"/>
+    <w:lsdException w:name="List Table 4" w:uiPriority="49"/>
+    <w:lsdException w:name="List Table 5 Dark" w:uiPriority="50"/>
+    <w:lsdException w:name="List Table 6 Colorful" w:uiPriority="51"/>
+    <w:lsdException w:name="List Table 7 Colorful" w:uiPriority="52"/>
+    <w:lsdException w:name="List Table 1 Light Accent 1" w:uiPriority="46"/>
+    <w:lsdException w:name="List Table 2 Accent 1" w:uiPriority="47"/>
+    <w:lsdException w:name="List Table 3 Accent 1" w:uiPriority="48"/>
+    <w:lsdException w:name="List Table 4 Accent 1" w:uiPriority="49"/>
+    <w:lsdException w:name="List Table 5 Dark Accent 1" w:uiPriority="50"/>
+    <w:lsdException w:name="List Table 6 Colorful Accent 1" w:uiPriority="51"/>
+    <w:lsdException w:name="List Table 7 Colorful Accent 1" w:uiPriority="52"/>
+    <w:lsdException w:name="List Table 1 Light Accent 2" w:uiPriority="46"/>
+    <w:lsdException w:name="List Table 2 Accent 2" w:uiPriority="47"/>
+    <w:lsdException w:name="List Table 3 Accent 2" w:uiPriority="48"/>
+    <w:lsdException w:name="List Table 4 Accent 2" w:uiPriority="49"/>
+    <w:lsdException w:name="List Table 5 Dark Accent 2" w:uiPriority="50"/>
+    <w:lsdException w:name="List Table 6 Colorful Accent 2" w:uiPriority="51"/>
+    <w:lsdException w:name="List Table 7 Colorful Accent 2" w:uiPriority="52"/>
+    <w:lsdException w:name="List Table 1 Light Accent 3" w:uiPriority="46"/>
+    <w:lsdException w:name="List Table 2 Accent 3" w:uiPriority="47"/>
+    <w:lsdException w:name="List Table 3 Accent 3" w:uiPriority="48"/>
+    <w:lsdException w:name="List Table 4 Accent 3" w:uiPriority="49"/>
+    <w:lsdException w:name="List Table 5 Dark Accent 3" w:uiPriority="50"/>
+    <w:lsdException w:name="List Table 6 Colorful Accent 3" w:uiPriority="51"/>
+    <w:lsdException w:name="List Table 7 Colorful Accent 3" w:uiPriority="52"/>
+    <w:lsdException w:name="List Table 1 Light Accent 4" w:uiPriority="46"/>
+    <w:lsdException w:name="List Table 2 Accent 4" w:uiPriority="47"/>
+    <w:lsdException w:name="List Table 3 Accent 4" w:uiPriority="48"/>
+    <w:lsdException w:name="List Table 4 Accent 4" w:uiPriority="49"/>
+    <w:lsdException w:name="List Table 5 Dark Accent 4" w:uiPriority="50"/>
+    <w:lsdException w:name="List Table 6 Colorful Accent 4" w:uiPriority="51"/>
+    <w:lsdException w:name="List Table 7 Colorful Accent 4" w:uiPriority="52"/>
+    <w:lsdException w:name="List Table 1 Light Accent 5" w:uiPriority="46"/>
+    <w:lsdException w:name="List Table 2 Accent 5" w:uiPriority="47"/>
+    <w:lsdException w:name="List Table 3 Accent 5" w:uiPriority="48"/>
+    <w:lsdException w:name="List Table 4 Accent 5" w:uiPriority="49"/>
+    <w:lsdException w:name="List Table 5 Dark Accent 5" w:uiPriority="50"/>
+    <w:lsdException w:name="List Table 6 Colorful Accent 5" w:uiPriority="51"/>
+    <w:lsdException w:name="List Table 7 Colorful Accent 5" w:uiPriority="52"/>
+    <w:lsdException w:name="List Table 1 Light Accent 6" w:uiPriority="46"/>
+    <w:lsdException w:name="List Table 2 Accent 6" w:uiPriority="47"/>
+    <w:lsdException w:name="List Table 3 Accent 6" w:uiPriority="48"/>
+    <w:lsdException w:name="List Table 4 Accent 6" w:uiPriority="49"/>
+    <w:lsdException w:name="List Table 5 Dark Accent 6" w:uiPriority="50"/>
+    <w:lsdException w:name="List Table 6 Colorful Accent 6" w:uiPriority="51"/>
+    <w:lsdException w:name="List Table 7 Colorful Accent 6" w:uiPriority="52"/>
+    <w:lsdException w:name="Mention" w:semiHidden="1" w:uiPriority="99" w:unhideWhenUsed="1"/>
+    <w:lsdException w:name="Smart Hyperlink" w:semiHidden="1" w:uiPriority="99" w:unhideWhenUsed="1"/>
+    <w:lsdException w:name="Hashtag" w:semiHidden="1" w:uiPriority="99" w:unhideWhenUsed="1"/>
+    <w:lsdException w:name="Unresolved Mention" w:semiHidden="1" w:uiPriority="99" w:unhideWhenUsed="1"/>
+    <w:lsdException w:name="Smart Link" w:semiHidden="1" w:uiPriority="99" w:unhideWhenUsed="1"/>
+  </w:latentStyles>
+  <w:style w:type="paragraph" w:default="1" w:styleId="a">
     <w:name w:val="Normal"/>
     <w:qFormat/>
   </w:style>
-  <w:style w:styleId="BodyText" w:type="paragraph">
-    <w:name w:val="Body Text"/>
-    <w:basedOn w:val="Normal"/>
-    <w:link w:val="BodyTextChar"/>
-    <w:qFormat/>
-    <w:pPr>
-      <w:spacing w:after="180" w:before="180"/>
-    </w:pPr>
-  </w:style>
-  <w:style w:customStyle="1" w:styleId="FirstParagraph" w:type="paragraph">
-    <w:name w:val="First Paragraph"/>
-    <w:basedOn w:val="BodyText"/>
-    <w:next w:val="BodyText"/>
-    <w:qFormat/>
-  </w:style>
-  <w:style w:customStyle="1" w:styleId="Compact" w:type="paragraph">
-    <w:name w:val="Compact"/>
-    <w:basedOn w:val="BodyText"/>
-    <w:qFormat/>
-    <w:pPr>
-      <w:spacing w:after="36" w:before="36"/>
-    </w:pPr>
-  </w:style>
-  <w:style w:styleId="Title" w:type="paragraph">
-    <w:name w:val="Title"/>
-    <w:basedOn w:val="Normal"/>
-    <w:next w:val="BodyText"/>
-    <w:link w:val="TitleChar"/>
-    <w:uiPriority w:val="10"/>
-    <w:qFormat/>
-    <w:rsid w:val="00A10FD9"/>
-    <w:pPr>
-      <w:spacing w:after="80" w:line="240" w:lineRule="auto"/>
-      <w:contextualSpacing/>
-      <w:jc w:val="center"/>
-    </w:pPr>
-    <w:rPr>
-      <w:rFonts w:asciiTheme="majorHAnsi" w:cstheme="majorBidi" w:eastAsiaTheme="majorEastAsia" w:hAnsiTheme="majorHAnsi"/>
-      <w:sz w:val="56"/>
-      <w:szCs w:val="56"/>
-    </w:rPr>
-  </w:style>
-  <w:style w:customStyle="1" w:styleId="TitleChar" w:type="character">
-    <w:name w:val="Title Char"/>
-    <w:basedOn w:val="DefaultParagraphFont"/>
-    <w:link w:val="Title"/>
-    <w:uiPriority w:val="10"/>
-    <w:rsid w:val="00A10FD9"/>
-    <w:rPr>
-      <w:rFonts w:asciiTheme="majorHAnsi" w:cstheme="majorBidi" w:eastAsiaTheme="majorEastAsia" w:hAnsiTheme="majorHAnsi"/>
-      <w:sz w:val="56"/>
-      <w:szCs w:val="56"/>
-    </w:rPr>
-  </w:style>
-  <w:style w:styleId="Subtitle" w:type="paragraph">
-    <w:name w:val="Subtitle"/>
-    <w:basedOn w:val="Title"/>
-    <w:next w:val="BodyText"/>
-    <w:link w:val="SubtitleChar"/>
-    <w:uiPriority w:val="11"/>
-    <w:qFormat/>
-    <w:rsid w:val="00A10FD9"/>
-    <w:pPr>
-      <w:numPr>
-        <w:ilvl w:val="1"/>
-      </w:numPr>
-    </w:pPr>
-    <w:rPr>
-      <w:rFonts w:cstheme="majorBidi" w:eastAsiaTheme="majorEastAsia"/>
-      <w:spacing w:val="15"/>
-      <w:sz w:val="28"/>
-      <w:szCs w:val="28"/>
-    </w:rPr>
-  </w:style>
-  <w:style w:customStyle="1" w:styleId="SubtitleChar" w:type="character">
-    <w:name w:val="Subtitle Char"/>
-    <w:basedOn w:val="DefaultParagraphFont"/>
-    <w:link w:val="Subtitle"/>
-    <w:uiPriority w:val="11"/>
-    <w:rsid w:val="00A10FD9"/>
-    <w:rPr>
-      <w:rFonts w:cstheme="majorBidi" w:eastAsiaTheme="majorEastAsia"/>
-      <w:color w:themeColor="text1" w:themeTint="A6" w:val="595959"/>
-      <w:spacing w:val="15"/>
-      <w:sz w:val="28"/>
-      <w:szCs w:val="28"/>
-    </w:rPr>
-  </w:style>
-  <w:style w:customStyle="1" w:styleId="Author" w:type="paragraph">
-    <w:name w:val="Author"/>
-    <w:basedOn w:val="Title"/>
-    <w:next w:val="BodyText"/>
-    <w:qFormat/>
-    <w:pPr>
-      <w:keepNext/>
-      <w:keepLines/>
-    </w:pPr>
-    <w:rPr>
-      <w:sz w:val="24"/>
-      <w:szCs w:val="24"/>
-    </w:rPr>
-  </w:style>
-  <w:style w:styleId="Date" w:type="paragraph">
-    <w:name w:val="Date"/>
-    <w:basedOn w:val="Title"/>
-    <w:next w:val="BodyText"/>
-    <w:qFormat/>
-    <w:pPr>
-      <w:keepNext/>
-      <w:keepLines/>
-    </w:pPr>
-    <w:rPr>
-      <w:sz w:val="24"/>
-      <w:szCs w:val="24"/>
-    </w:rPr>
-  </w:style>
-  <w:style w:customStyle="1" w:styleId="AbstractTitle" w:type="paragraph">
-    <w:name w:val="Abstract Title"/>
-    <w:basedOn w:val="Normal"/>
-    <w:next w:val="Abstract"/>
-    <w:qFormat/>
-    <w:pPr>
-      <w:keepNext/>
-      <w:keepLines/>
-      <w:spacing w:after="0" w:before="300"/>
-      <w:jc w:val="center"/>
-    </w:pPr>
-    <w:rPr>
-      <w:b/>
-      <w:sz w:val="20"/>
-      <w:szCs w:val="20"/>
-    </w:rPr>
-  </w:style>
-  <w:style w:customStyle="1" w:styleId="Abstract" w:type="paragraph">
-    <w:name w:val="Abstract"/>
-    <w:basedOn w:val="Normal"/>
-    <w:next w:val="BodyText"/>
-    <w:qFormat/>
-    <w:pPr>
-      <w:keepNext/>
-      <w:keepLines/>
-      <w:spacing w:after="300" w:before="100"/>
-    </w:pPr>
-    <w:rPr>
-      <w:sz w:val="20"/>
-      <w:szCs w:val="20"/>
-    </w:rPr>
-  </w:style>
-  <w:style w:styleId="Bibliography" w:type="paragraph">
-    <w:name w:val="Bibliography"/>
-    <w:basedOn w:val="Normal"/>
-    <w:next w:val="Bibliography"/>
-    <w:qFormat/>
-    <w:pPr/>
-    <w:rPr/>
-  </w:style>
-  <w:style w:styleId="Heading1" w:type="paragraph">
+  <w:style w:type="paragraph" w:styleId="1">
     <w:name w:val="heading 1"/>
-    <w:basedOn w:val="Normal"/>
-    <w:next w:val="BodyText"/>
-    <w:link w:val="Heading1Char"/>
+    <w:basedOn w:val="a"/>
+    <w:next w:val="a0"/>
+    <w:link w:val="10"/>
     <w:uiPriority w:val="9"/>
     <w:qFormat/>
     <w:rsid w:val="00A10FD9"/>
     <w:pPr>
       <w:keepNext/>
       <w:keepLines/>
-      <w:spacing w:after="80" w:before="360"/>
+      <w:spacing w:before="360" w:after="80"/>
       <w:outlineLvl w:val="0"/>
     </w:pPr>
     <w:rPr>
-      <w:rFonts w:asciiTheme="majorHAnsi" w:cstheme="majorBidi" w:eastAsiaTheme="majorEastAsia" w:hAnsiTheme="majorHAnsi"/>
-      <w:color w:themeColor="accent1" w:themeShade="BF" w:val="0F4761"/>
+      <w:rFonts w:asciiTheme="majorHAnsi" w:eastAsiaTheme="majorEastAsia" w:hAnsiTheme="majorHAnsi" w:cstheme="majorBidi"/>
+      <w:color w:val="0F4761" w:themeColor="accent1" w:themeShade="BF"/>
       <w:sz w:val="40"/>
       <w:szCs w:val="40"/>
     </w:rPr>
   </w:style>
-  <w:style w:styleId="Heading2" w:type="paragraph">
+  <w:style w:type="paragraph" w:styleId="2">
     <w:name w:val="heading 2"/>
-    <w:basedOn w:val="Normal"/>
-    <w:next w:val="BodyText"/>
-    <w:link w:val="Heading2Char"/>
+    <w:basedOn w:val="a"/>
+    <w:next w:val="a0"/>
+    <w:link w:val="20"/>
     <w:uiPriority w:val="9"/>
     <w:semiHidden/>
     <w:unhideWhenUsed/>
@@ -1391,21 +1388,21 @@
     <w:pPr>
       <w:keepNext/>
       <w:keepLines/>
-      <w:spacing w:after="80" w:before="160"/>
+      <w:spacing w:before="160" w:after="80"/>
       <w:outlineLvl w:val="1"/>
     </w:pPr>
     <w:rPr>
-      <w:rFonts w:asciiTheme="majorHAnsi" w:cstheme="majorBidi" w:eastAsiaTheme="majorEastAsia" w:hAnsiTheme="majorHAnsi"/>
-      <w:color w:themeColor="accent1" w:themeShade="BF" w:val="0F4761"/>
+      <w:rFonts w:asciiTheme="majorHAnsi" w:eastAsiaTheme="majorEastAsia" w:hAnsiTheme="majorHAnsi" w:cstheme="majorBidi"/>
+      <w:color w:val="0F4761" w:themeColor="accent1" w:themeShade="BF"/>
       <w:sz w:val="32"/>
       <w:szCs w:val="32"/>
     </w:rPr>
   </w:style>
-  <w:style w:styleId="Heading3" w:type="paragraph">
+  <w:style w:type="paragraph" w:styleId="3">
     <w:name w:val="heading 3"/>
-    <w:basedOn w:val="Normal"/>
-    <w:next w:val="BodyText"/>
-    <w:link w:val="Heading3Char"/>
+    <w:basedOn w:val="a"/>
+    <w:next w:val="a0"/>
+    <w:link w:val="30"/>
     <w:uiPriority w:val="9"/>
     <w:semiHidden/>
     <w:unhideWhenUsed/>
@@ -1414,21 +1411,21 @@
     <w:pPr>
       <w:keepNext/>
       <w:keepLines/>
-      <w:spacing w:after="80" w:before="160"/>
+      <w:spacing w:before="160" w:after="80"/>
       <w:outlineLvl w:val="2"/>
     </w:pPr>
     <w:rPr>
-      <w:rFonts w:cstheme="majorBidi" w:eastAsiaTheme="majorEastAsia"/>
-      <w:color w:themeColor="accent1" w:themeShade="BF" w:val="0F4761"/>
+      <w:rFonts w:eastAsiaTheme="majorEastAsia" w:cstheme="majorBidi"/>
+      <w:color w:val="0F4761" w:themeColor="accent1" w:themeShade="BF"/>
       <w:sz w:val="28"/>
       <w:szCs w:val="28"/>
     </w:rPr>
   </w:style>
-  <w:style w:styleId="Heading4" w:type="paragraph">
+  <w:style w:type="paragraph" w:styleId="4">
     <w:name w:val="heading 4"/>
-    <w:basedOn w:val="Normal"/>
-    <w:next w:val="BodyText"/>
-    <w:link w:val="Heading4Char"/>
+    <w:basedOn w:val="a"/>
+    <w:next w:val="a0"/>
+    <w:link w:val="40"/>
     <w:uiPriority w:val="9"/>
     <w:semiHidden/>
     <w:unhideWhenUsed/>
@@ -1437,21 +1434,21 @@
     <w:pPr>
       <w:keepNext/>
       <w:keepLines/>
-      <w:spacing w:after="40" w:before="80"/>
+      <w:spacing w:before="80" w:after="40"/>
       <w:outlineLvl w:val="3"/>
     </w:pPr>
     <w:rPr>
-      <w:rFonts w:cstheme="majorBidi" w:eastAsiaTheme="majorEastAsia"/>
+      <w:rFonts w:eastAsiaTheme="majorEastAsia" w:cstheme="majorBidi"/>
       <w:i/>
       <w:iCs/>
-      <w:color w:themeColor="accent1" w:themeShade="BF" w:val="0F4761"/>
-    </w:rPr>
-  </w:style>
-  <w:style w:styleId="Heading5" w:type="paragraph">
+      <w:color w:val="0F4761" w:themeColor="accent1" w:themeShade="BF"/>
+    </w:rPr>
+  </w:style>
+  <w:style w:type="paragraph" w:styleId="5">
     <w:name w:val="heading 5"/>
-    <w:basedOn w:val="Normal"/>
-    <w:next w:val="BodyText"/>
-    <w:link w:val="Heading5Char"/>
+    <w:basedOn w:val="a"/>
+    <w:next w:val="a0"/>
+    <w:link w:val="50"/>
     <w:uiPriority w:val="9"/>
     <w:semiHidden/>
     <w:unhideWhenUsed/>
@@ -1460,19 +1457,19 @@
     <w:pPr>
       <w:keepNext/>
       <w:keepLines/>
-      <w:spacing w:after="40" w:before="80"/>
+      <w:spacing w:before="80" w:after="40"/>
       <w:outlineLvl w:val="4"/>
     </w:pPr>
     <w:rPr>
-      <w:rFonts w:cstheme="majorBidi" w:eastAsiaTheme="majorEastAsia"/>
-      <w:color w:themeColor="accent1" w:themeShade="BF" w:val="0F4761"/>
-    </w:rPr>
-  </w:style>
-  <w:style w:styleId="Heading6" w:type="paragraph">
+      <w:rFonts w:eastAsiaTheme="majorEastAsia" w:cstheme="majorBidi"/>
+      <w:color w:val="0F4761" w:themeColor="accent1" w:themeShade="BF"/>
+    </w:rPr>
+  </w:style>
+  <w:style w:type="paragraph" w:styleId="6">
     <w:name w:val="heading 6"/>
-    <w:basedOn w:val="Normal"/>
-    <w:next w:val="BodyText"/>
-    <w:link w:val="Heading6Char"/>
+    <w:basedOn w:val="a"/>
+    <w:next w:val="a0"/>
+    <w:link w:val="60"/>
     <w:uiPriority w:val="9"/>
     <w:semiHidden/>
     <w:unhideWhenUsed/>
@@ -1481,21 +1478,21 @@
     <w:pPr>
       <w:keepNext/>
       <w:keepLines/>
-      <w:spacing w:after="0" w:before="40"/>
+      <w:spacing w:before="40" w:after="0"/>
       <w:outlineLvl w:val="5"/>
     </w:pPr>
     <w:rPr>
-      <w:rFonts w:cstheme="majorBidi" w:eastAsiaTheme="majorEastAsia"/>
+      <w:rFonts w:eastAsiaTheme="majorEastAsia" w:cstheme="majorBidi"/>
       <w:i/>
       <w:iCs/>
-      <w:color w:themeColor="text1" w:themeTint="A6" w:val="595959"/>
-    </w:rPr>
-  </w:style>
-  <w:style w:styleId="Heading7" w:type="paragraph">
+      <w:color w:val="595959" w:themeColor="text1" w:themeTint="A6"/>
+    </w:rPr>
+  </w:style>
+  <w:style w:type="paragraph" w:styleId="7">
     <w:name w:val="heading 7"/>
-    <w:basedOn w:val="Normal"/>
-    <w:next w:val="BodyText"/>
-    <w:link w:val="Heading7Char"/>
+    <w:basedOn w:val="a"/>
+    <w:next w:val="a0"/>
+    <w:link w:val="70"/>
     <w:uiPriority w:val="9"/>
     <w:semiHidden/>
     <w:unhideWhenUsed/>
@@ -1504,19 +1501,19 @@
     <w:pPr>
       <w:keepNext/>
       <w:keepLines/>
-      <w:spacing w:after="0" w:before="40"/>
+      <w:spacing w:before="40" w:after="0"/>
       <w:outlineLvl w:val="6"/>
     </w:pPr>
     <w:rPr>
-      <w:rFonts w:cstheme="majorBidi" w:eastAsiaTheme="majorEastAsia"/>
-      <w:color w:themeColor="text1" w:themeTint="A6" w:val="595959"/>
-    </w:rPr>
-  </w:style>
-  <w:style w:styleId="Heading8" w:type="paragraph">
+      <w:rFonts w:eastAsiaTheme="majorEastAsia" w:cstheme="majorBidi"/>
+      <w:color w:val="595959" w:themeColor="text1" w:themeTint="A6"/>
+    </w:rPr>
+  </w:style>
+  <w:style w:type="paragraph" w:styleId="8">
     <w:name w:val="heading 8"/>
-    <w:basedOn w:val="Normal"/>
-    <w:next w:val="BodyText"/>
-    <w:link w:val="Heading8Char"/>
+    <w:basedOn w:val="a"/>
+    <w:next w:val="a0"/>
+    <w:link w:val="80"/>
     <w:uiPriority w:val="9"/>
     <w:semiHidden/>
     <w:unhideWhenUsed/>
@@ -1529,17 +1526,17 @@
       <w:outlineLvl w:val="7"/>
     </w:pPr>
     <w:rPr>
-      <w:rFonts w:cstheme="majorBidi" w:eastAsiaTheme="majorEastAsia"/>
+      <w:rFonts w:eastAsiaTheme="majorEastAsia" w:cstheme="majorBidi"/>
       <w:i/>
       <w:iCs/>
-      <w:color w:themeColor="text1" w:themeTint="D8" w:val="272727"/>
-    </w:rPr>
-  </w:style>
-  <w:style w:styleId="Heading9" w:type="paragraph">
+      <w:color w:val="272727" w:themeColor="text1" w:themeTint="D8"/>
+    </w:rPr>
+  </w:style>
+  <w:style w:type="paragraph" w:styleId="9">
     <w:name w:val="heading 9"/>
-    <w:basedOn w:val="Normal"/>
-    <w:next w:val="BodyText"/>
-    <w:link w:val="Heading9Char"/>
+    <w:basedOn w:val="a"/>
+    <w:next w:val="a0"/>
+    <w:link w:val="90"/>
     <w:uiPriority w:val="9"/>
     <w:semiHidden/>
     <w:unhideWhenUsed/>
@@ -1552,193 +1549,365 @@
       <w:outlineLvl w:val="8"/>
     </w:pPr>
     <w:rPr>
-      <w:rFonts w:cstheme="majorBidi" w:eastAsiaTheme="majorEastAsia"/>
-      <w:color w:themeColor="text1" w:themeTint="D8" w:val="272727"/>
-    </w:rPr>
-  </w:style>
-  <w:style w:customStyle="1" w:styleId="Heading1Char" w:type="character">
-    <w:name w:val="Heading 1 Char"/>
-    <w:basedOn w:val="DefaultParagraphFont"/>
-    <w:link w:val="Heading1"/>
+      <w:rFonts w:eastAsiaTheme="majorEastAsia" w:cstheme="majorBidi"/>
+      <w:color w:val="272727" w:themeColor="text1" w:themeTint="D8"/>
+    </w:rPr>
+  </w:style>
+  <w:style w:type="character" w:default="1" w:styleId="a1">
+    <w:name w:val="Default Paragraph Font"/>
+    <w:uiPriority w:val="1"/>
+    <w:semiHidden/>
+    <w:unhideWhenUsed/>
+  </w:style>
+  <w:style w:type="table" w:default="1" w:styleId="a2">
+    <w:name w:val="Normal Table"/>
+    <w:uiPriority w:val="99"/>
+    <w:semiHidden/>
+    <w:unhideWhenUsed/>
+    <w:tblPr>
+      <w:tblInd w:w="0" w:type="dxa"/>
+      <w:tblCellMar>
+        <w:top w:w="0" w:type="dxa"/>
+        <w:left w:w="108" w:type="dxa"/>
+        <w:bottom w:w="0" w:type="dxa"/>
+        <w:right w:w="108" w:type="dxa"/>
+      </w:tblCellMar>
+    </w:tblPr>
+  </w:style>
+  <w:style w:type="numbering" w:default="1" w:styleId="a3">
+    <w:name w:val="No List"/>
+    <w:uiPriority w:val="99"/>
+    <w:semiHidden/>
+    <w:unhideWhenUsed/>
+  </w:style>
+  <w:style w:type="paragraph" w:styleId="a0">
+    <w:name w:val="Body Text"/>
+    <w:basedOn w:val="a"/>
+    <w:qFormat/>
+    <w:pPr>
+      <w:spacing w:before="180" w:after="180"/>
+    </w:pPr>
+  </w:style>
+  <w:style w:type="paragraph" w:customStyle="1" w:styleId="FirstParagraph">
+    <w:name w:val="First Paragraph"/>
+    <w:basedOn w:val="a0"/>
+    <w:next w:val="a0"/>
+    <w:qFormat/>
+  </w:style>
+  <w:style w:type="paragraph" w:customStyle="1" w:styleId="Compact">
+    <w:name w:val="Compact"/>
+    <w:basedOn w:val="a0"/>
+    <w:qFormat/>
+    <w:pPr>
+      <w:spacing w:before="36" w:after="36"/>
+    </w:pPr>
+  </w:style>
+  <w:style w:type="paragraph" w:styleId="a4">
+    <w:name w:val="Title"/>
+    <w:basedOn w:val="a"/>
+    <w:next w:val="a0"/>
+    <w:link w:val="a5"/>
+    <w:uiPriority w:val="10"/>
+    <w:qFormat/>
+    <w:rsid w:val="00A10FD9"/>
+    <w:pPr>
+      <w:spacing w:after="80"/>
+      <w:contextualSpacing/>
+      <w:jc w:val="center"/>
+    </w:pPr>
+    <w:rPr>
+      <w:rFonts w:asciiTheme="majorHAnsi" w:eastAsiaTheme="majorEastAsia" w:hAnsiTheme="majorHAnsi" w:cstheme="majorBidi"/>
+      <w:sz w:val="56"/>
+      <w:szCs w:val="56"/>
+    </w:rPr>
+  </w:style>
+  <w:style w:type="character" w:customStyle="1" w:styleId="a5">
+    <w:name w:val="表題 (文字)"/>
+    <w:basedOn w:val="a1"/>
+    <w:link w:val="a4"/>
+    <w:uiPriority w:val="10"/>
+    <w:rsid w:val="00A10FD9"/>
+    <w:rPr>
+      <w:rFonts w:asciiTheme="majorHAnsi" w:eastAsiaTheme="majorEastAsia" w:hAnsiTheme="majorHAnsi" w:cstheme="majorBidi"/>
+      <w:sz w:val="56"/>
+      <w:szCs w:val="56"/>
+    </w:rPr>
+  </w:style>
+  <w:style w:type="paragraph" w:styleId="a6">
+    <w:name w:val="Subtitle"/>
+    <w:basedOn w:val="a4"/>
+    <w:next w:val="a0"/>
+    <w:link w:val="a7"/>
+    <w:uiPriority w:val="11"/>
+    <w:qFormat/>
+    <w:rsid w:val="00A10FD9"/>
+    <w:pPr>
+      <w:numPr>
+        <w:ilvl w:val="1"/>
+      </w:numPr>
+    </w:pPr>
+    <w:rPr>
+      <w:spacing w:val="15"/>
+      <w:sz w:val="28"/>
+      <w:szCs w:val="28"/>
+    </w:rPr>
+  </w:style>
+  <w:style w:type="character" w:customStyle="1" w:styleId="a7">
+    <w:name w:val="副題 (文字)"/>
+    <w:basedOn w:val="a1"/>
+    <w:link w:val="a6"/>
+    <w:uiPriority w:val="11"/>
+    <w:rsid w:val="00A10FD9"/>
+    <w:rPr>
+      <w:rFonts w:eastAsiaTheme="majorEastAsia" w:cstheme="majorBidi"/>
+      <w:color w:val="595959" w:themeColor="text1" w:themeTint="A6"/>
+      <w:spacing w:val="15"/>
+      <w:sz w:val="28"/>
+      <w:szCs w:val="28"/>
+    </w:rPr>
+  </w:style>
+  <w:style w:type="paragraph" w:customStyle="1" w:styleId="Author">
+    <w:name w:val="Author"/>
+    <w:basedOn w:val="a4"/>
+    <w:next w:val="a0"/>
+    <w:qFormat/>
+    <w:pPr>
+      <w:keepNext/>
+      <w:keepLines/>
+    </w:pPr>
+    <w:rPr>
+      <w:sz w:val="24"/>
+      <w:szCs w:val="24"/>
+    </w:rPr>
+  </w:style>
+  <w:style w:type="paragraph" w:styleId="a8">
+    <w:name w:val="Date"/>
+    <w:basedOn w:val="a4"/>
+    <w:next w:val="a0"/>
+    <w:qFormat/>
+    <w:pPr>
+      <w:keepNext/>
+      <w:keepLines/>
+    </w:pPr>
+    <w:rPr>
+      <w:sz w:val="24"/>
+      <w:szCs w:val="24"/>
+    </w:rPr>
+  </w:style>
+  <w:style w:type="paragraph" w:customStyle="1" w:styleId="AbstractTitle">
+    <w:name w:val="Abstract Title"/>
+    <w:basedOn w:val="a"/>
+    <w:next w:val="Abstract"/>
+    <w:qFormat/>
+    <w:pPr>
+      <w:keepNext/>
+      <w:keepLines/>
+      <w:spacing w:before="300" w:after="0"/>
+      <w:jc w:val="center"/>
+    </w:pPr>
+    <w:rPr>
+      <w:b/>
+      <w:sz w:val="20"/>
+      <w:szCs w:val="20"/>
+    </w:rPr>
+  </w:style>
+  <w:style w:type="paragraph" w:customStyle="1" w:styleId="Abstract">
+    <w:name w:val="Abstract"/>
+    <w:basedOn w:val="a"/>
+    <w:next w:val="a0"/>
+    <w:qFormat/>
+    <w:pPr>
+      <w:keepNext/>
+      <w:keepLines/>
+      <w:spacing w:before="100" w:after="300"/>
+    </w:pPr>
+    <w:rPr>
+      <w:sz w:val="20"/>
+      <w:szCs w:val="20"/>
+    </w:rPr>
+  </w:style>
+  <w:style w:type="paragraph" w:styleId="a9">
+    <w:name w:val="Bibliography"/>
+    <w:basedOn w:val="a"/>
+    <w:qFormat/>
+  </w:style>
+  <w:style w:type="character" w:customStyle="1" w:styleId="10">
+    <w:name w:val="見出し 1 (文字)"/>
+    <w:basedOn w:val="a1"/>
+    <w:link w:val="1"/>
     <w:uiPriority w:val="9"/>
     <w:rsid w:val="00A10FD9"/>
     <w:rPr>
-      <w:rFonts w:asciiTheme="majorHAnsi" w:cstheme="majorBidi" w:eastAsiaTheme="majorEastAsia" w:hAnsiTheme="majorHAnsi"/>
-      <w:color w:themeColor="accent1" w:themeShade="BF" w:val="0F4761"/>
+      <w:rFonts w:asciiTheme="majorHAnsi" w:eastAsiaTheme="majorEastAsia" w:hAnsiTheme="majorHAnsi" w:cstheme="majorBidi"/>
+      <w:color w:val="0F4761" w:themeColor="accent1" w:themeShade="BF"/>
       <w:sz w:val="40"/>
       <w:szCs w:val="40"/>
     </w:rPr>
   </w:style>
-  <w:style w:customStyle="1" w:styleId="Heading2Char" w:type="character">
-    <w:name w:val="Heading 2 Char"/>
-    <w:basedOn w:val="DefaultParagraphFont"/>
-    <w:link w:val="Heading2"/>
+  <w:style w:type="character" w:customStyle="1" w:styleId="20">
+    <w:name w:val="見出し 2 (文字)"/>
+    <w:basedOn w:val="a1"/>
+    <w:link w:val="2"/>
     <w:uiPriority w:val="9"/>
     <w:semiHidden/>
     <w:rsid w:val="00A10FD9"/>
     <w:rPr>
-      <w:rFonts w:asciiTheme="majorHAnsi" w:cstheme="majorBidi" w:eastAsiaTheme="majorEastAsia" w:hAnsiTheme="majorHAnsi"/>
-      <w:color w:themeColor="accent1" w:themeShade="BF" w:val="0F4761"/>
+      <w:rFonts w:asciiTheme="majorHAnsi" w:eastAsiaTheme="majorEastAsia" w:hAnsiTheme="majorHAnsi" w:cstheme="majorBidi"/>
+      <w:color w:val="0F4761" w:themeColor="accent1" w:themeShade="BF"/>
       <w:sz w:val="32"/>
       <w:szCs w:val="32"/>
     </w:rPr>
   </w:style>
-  <w:style w:customStyle="1" w:styleId="Heading3Char" w:type="character">
-    <w:name w:val="Heading 3 Char"/>
-    <w:basedOn w:val="DefaultParagraphFont"/>
-    <w:link w:val="Heading3"/>
+  <w:style w:type="character" w:customStyle="1" w:styleId="30">
+    <w:name w:val="見出し 3 (文字)"/>
+    <w:basedOn w:val="a1"/>
+    <w:link w:val="3"/>
     <w:uiPriority w:val="9"/>
     <w:semiHidden/>
     <w:rsid w:val="00A10FD9"/>
     <w:rPr>
-      <w:rFonts w:cstheme="majorBidi" w:eastAsiaTheme="majorEastAsia"/>
-      <w:color w:themeColor="accent1" w:themeShade="BF" w:val="0F4761"/>
+      <w:rFonts w:eastAsiaTheme="majorEastAsia" w:cstheme="majorBidi"/>
+      <w:color w:val="0F4761" w:themeColor="accent1" w:themeShade="BF"/>
       <w:sz w:val="28"/>
       <w:szCs w:val="28"/>
     </w:rPr>
   </w:style>
-  <w:style w:customStyle="1" w:styleId="Heading4Char" w:type="character">
-    <w:name w:val="Heading 4 Char"/>
-    <w:basedOn w:val="DefaultParagraphFont"/>
-    <w:link w:val="Heading4"/>
+  <w:style w:type="character" w:customStyle="1" w:styleId="40">
+    <w:name w:val="見出し 4 (文字)"/>
+    <w:basedOn w:val="a1"/>
+    <w:link w:val="4"/>
     <w:uiPriority w:val="9"/>
     <w:semiHidden/>
     <w:rsid w:val="00A10FD9"/>
     <w:rPr>
-      <w:rFonts w:cstheme="majorBidi" w:eastAsiaTheme="majorEastAsia"/>
+      <w:rFonts w:eastAsiaTheme="majorEastAsia" w:cstheme="majorBidi"/>
       <w:i/>
       <w:iCs/>
-      <w:color w:themeColor="accent1" w:themeShade="BF" w:val="0F4761"/>
-    </w:rPr>
-  </w:style>
-  <w:style w:customStyle="1" w:styleId="Heading5Char" w:type="character">
-    <w:name w:val="Heading 5 Char"/>
-    <w:basedOn w:val="DefaultParagraphFont"/>
-    <w:link w:val="Heading5"/>
+      <w:color w:val="0F4761" w:themeColor="accent1" w:themeShade="BF"/>
+    </w:rPr>
+  </w:style>
+  <w:style w:type="character" w:customStyle="1" w:styleId="50">
+    <w:name w:val="見出し 5 (文字)"/>
+    <w:basedOn w:val="a1"/>
+    <w:link w:val="5"/>
     <w:uiPriority w:val="9"/>
     <w:semiHidden/>
     <w:rsid w:val="00A10FD9"/>
     <w:rPr>
-      <w:rFonts w:cstheme="majorBidi" w:eastAsiaTheme="majorEastAsia"/>
-      <w:color w:themeColor="accent1" w:themeShade="BF" w:val="0F4761"/>
-    </w:rPr>
-  </w:style>
-  <w:style w:customStyle="1" w:styleId="Heading6Char" w:type="character">
-    <w:name w:val="Heading 6 Char"/>
-    <w:basedOn w:val="DefaultParagraphFont"/>
-    <w:link w:val="Heading6"/>
+      <w:rFonts w:eastAsiaTheme="majorEastAsia" w:cstheme="majorBidi"/>
+      <w:color w:val="0F4761" w:themeColor="accent1" w:themeShade="BF"/>
+    </w:rPr>
+  </w:style>
+  <w:style w:type="character" w:customStyle="1" w:styleId="60">
+    <w:name w:val="見出し 6 (文字)"/>
+    <w:basedOn w:val="a1"/>
+    <w:link w:val="6"/>
     <w:uiPriority w:val="9"/>
     <w:semiHidden/>
     <w:rsid w:val="00A10FD9"/>
     <w:rPr>
-      <w:rFonts w:cstheme="majorBidi" w:eastAsiaTheme="majorEastAsia"/>
+      <w:rFonts w:eastAsiaTheme="majorEastAsia" w:cstheme="majorBidi"/>
       <w:i/>
       <w:iCs/>
-      <w:color w:themeColor="text1" w:themeTint="A6" w:val="595959"/>
-    </w:rPr>
-  </w:style>
-  <w:style w:customStyle="1" w:styleId="Heading7Char" w:type="character">
-    <w:name w:val="Heading 7 Char"/>
-    <w:basedOn w:val="DefaultParagraphFont"/>
-    <w:link w:val="Heading7"/>
+      <w:color w:val="595959" w:themeColor="text1" w:themeTint="A6"/>
+    </w:rPr>
+  </w:style>
+  <w:style w:type="character" w:customStyle="1" w:styleId="70">
+    <w:name w:val="見出し 7 (文字)"/>
+    <w:basedOn w:val="a1"/>
+    <w:link w:val="7"/>
     <w:uiPriority w:val="9"/>
     <w:semiHidden/>
     <w:rsid w:val="00A10FD9"/>
     <w:rPr>
-      <w:rFonts w:cstheme="majorBidi" w:eastAsiaTheme="majorEastAsia"/>
-      <w:color w:themeColor="text1" w:themeTint="A6" w:val="595959"/>
-    </w:rPr>
-  </w:style>
-  <w:style w:customStyle="1" w:styleId="Heading8Char" w:type="character">
-    <w:name w:val="Heading 8 Char"/>
-    <w:basedOn w:val="DefaultParagraphFont"/>
-    <w:link w:val="Heading8"/>
+      <w:rFonts w:eastAsiaTheme="majorEastAsia" w:cstheme="majorBidi"/>
+      <w:color w:val="595959" w:themeColor="text1" w:themeTint="A6"/>
+    </w:rPr>
+  </w:style>
+  <w:style w:type="character" w:customStyle="1" w:styleId="80">
+    <w:name w:val="見出し 8 (文字)"/>
+    <w:basedOn w:val="a1"/>
+    <w:link w:val="8"/>
     <w:uiPriority w:val="9"/>
     <w:semiHidden/>
     <w:rsid w:val="00A10FD9"/>
     <w:rPr>
-      <w:rFonts w:cstheme="majorBidi" w:eastAsiaTheme="majorEastAsia"/>
+      <w:rFonts w:eastAsiaTheme="majorEastAsia" w:cstheme="majorBidi"/>
       <w:i/>
       <w:iCs/>
-      <w:color w:themeColor="text1" w:themeTint="D8" w:val="272727"/>
-    </w:rPr>
-  </w:style>
-  <w:style w:customStyle="1" w:styleId="Heading9Char" w:type="character">
-    <w:name w:val="Heading 9 Char"/>
-    <w:basedOn w:val="DefaultParagraphFont"/>
-    <w:link w:val="Heading9"/>
+      <w:color w:val="272727" w:themeColor="text1" w:themeTint="D8"/>
+    </w:rPr>
+  </w:style>
+  <w:style w:type="character" w:customStyle="1" w:styleId="90">
+    <w:name w:val="見出し 9 (文字)"/>
+    <w:basedOn w:val="a1"/>
+    <w:link w:val="9"/>
     <w:uiPriority w:val="9"/>
     <w:semiHidden/>
     <w:rsid w:val="00A10FD9"/>
     <w:rPr>
-      <w:rFonts w:cstheme="majorBidi" w:eastAsiaTheme="majorEastAsia"/>
-      <w:color w:themeColor="text1" w:themeTint="D8" w:val="272727"/>
-    </w:rPr>
-  </w:style>
-  <w:style w:styleId="BlockText" w:type="paragraph">
+      <w:rFonts w:eastAsiaTheme="majorEastAsia" w:cstheme="majorBidi"/>
+      <w:color w:val="272727" w:themeColor="text1" w:themeTint="D8"/>
+    </w:rPr>
+  </w:style>
+  <w:style w:type="paragraph" w:styleId="aa">
     <w:name w:val="Block Text"/>
-    <w:basedOn w:val="BodyText"/>
-    <w:next w:val="BodyText"/>
+    <w:basedOn w:val="a0"/>
+    <w:next w:val="a0"/>
     <w:uiPriority w:val="9"/>
     <w:unhideWhenUsed/>
     <w:qFormat/>
     <w:pPr>
-      <w:spacing w:after="100" w:before="100"/>
-      <w:ind w:firstLine="0" w:left="480" w:right="480"/>
+      <w:spacing w:before="100" w:after="100"/>
+      <w:ind w:left="480" w:right="480"/>
     </w:pPr>
   </w:style>
-  <w:style w:styleId="FootnoteText" w:type="paragraph">
-    <w:name w:val="Footnote Text"/>
-    <w:basedOn w:val="Normal"/>
-    <w:next w:val="FootnoteText"/>
+  <w:style w:type="paragraph" w:styleId="ab">
+    <w:name w:val="footnote text"/>
+    <w:basedOn w:val="a"/>
     <w:uiPriority w:val="9"/>
     <w:unhideWhenUsed/>
     <w:qFormat/>
   </w:style>
-  <w:style w:styleId="FootnoteBlockText" w:type="paragraph">
+  <w:style w:type="paragraph" w:customStyle="1" w:styleId="FootnoteBlockText">
     <w:name w:val="Footnote Block Text"/>
-    <w:basedOn w:val="FootnoteText"/>
-    <w:next w:val="FootnoteText"/>
+    <w:basedOn w:val="ab"/>
+    <w:next w:val="ab"/>
     <w:uiPriority w:val="9"/>
     <w:unhideWhenUsed/>
     <w:qFormat/>
     <w:pPr>
-      <w:spacing w:after="100" w:before="100"/>
-      <w:ind w:firstLine="0" w:left="480" w:right="480"/>
+      <w:spacing w:before="100" w:after="100"/>
+      <w:ind w:left="480" w:right="480"/>
     </w:pPr>
   </w:style>
-  <w:style w:default="1" w:styleId="DefaultParagraphFont" w:type="character">
-    <w:name w:val="Default Paragraph Font"/>
-    <w:semiHidden/>
-    <w:unhideWhenUsed/>
-  </w:style>
-  <w:style w:default="1" w:styleId="Table" w:type="table">
+  <w:style w:type="table" w:customStyle="1" w:styleId="Table">
     <w:name w:val="Table"/>
-    <w:basedOn w:val="TableNormal"/>
     <w:semiHidden/>
     <w:unhideWhenUsed/>
     <w:qFormat/>
     <w:tblPr>
-      <w:tblInd w:type="dxa" w:w="0"/>
+      <w:tblInd w:w="0" w:type="dxa"/>
       <w:tblCellMar>
-        <w:top w:type="dxa" w:w="0"/>
-        <w:left w:type="dxa" w:w="108"/>
-        <w:bottom w:type="dxa" w:w="0"/>
-        <w:right w:type="dxa" w:w="108"/>
+        <w:top w:w="0" w:type="dxa"/>
+        <w:left w:w="108" w:type="dxa"/>
+        <w:bottom w:w="0" w:type="dxa"/>
+        <w:right w:w="108" w:type="dxa"/>
       </w:tblCellMar>
     </w:tblPr>
     <w:tblStylePr w:type="firstRow">
+      <w:tblPr/>
       <w:tcPr>
         <w:tcBorders>
-          <w:bottom w:val="single"/>
+          <w:bottom w:val="single" w:sz="0" w:space="0" w:color="auto"/>
         </w:tcBorders>
         <w:vAlign w:val="bottom"/>
       </w:tcPr>
     </w:tblStylePr>
   </w:style>
-  <w:style w:customStyle="1" w:styleId="DefinitionTerm" w:type="paragraph">
+  <w:style w:type="paragraph" w:customStyle="1" w:styleId="DefinitionTerm">
     <w:name w:val="Definition Term"/>
-    <w:basedOn w:val="Normal"/>
+    <w:basedOn w:val="a"/>
     <w:next w:val="Definition"/>
     <w:pPr>
       <w:keepNext/>
@@ -1749,78 +1918,79 @@
       <w:b/>
     </w:rPr>
   </w:style>
-  <w:style w:customStyle="1" w:styleId="Definition" w:type="paragraph">
+  <w:style w:type="paragraph" w:customStyle="1" w:styleId="Definition">
     <w:name w:val="Definition"/>
-    <w:basedOn w:val="Normal"/>
-  </w:style>
-  <w:style w:styleId="Caption" w:type="paragraph">
-    <w:name w:val="Caption"/>
-    <w:basedOn w:val="Normal"/>
-    <w:link w:val="BodyTextChar"/>
+    <w:basedOn w:val="a"/>
+  </w:style>
+  <w:style w:type="paragraph" w:styleId="ac">
+    <w:name w:val="caption"/>
+    <w:basedOn w:val="a"/>
+    <w:link w:val="ad"/>
     <w:pPr>
-      <w:spacing w:after="120" w:before="0"/>
+      <w:spacing w:after="120"/>
     </w:pPr>
     <w:rPr>
       <w:i/>
     </w:rPr>
   </w:style>
-  <w:style w:customStyle="1" w:styleId="TableCaption" w:type="paragraph">
+  <w:style w:type="paragraph" w:customStyle="1" w:styleId="TableCaption">
     <w:name w:val="Table Caption"/>
-    <w:basedOn w:val="Caption"/>
+    <w:basedOn w:val="ac"/>
     <w:pPr>
       <w:keepNext/>
     </w:pPr>
   </w:style>
-  <w:style w:customStyle="1" w:styleId="ImageCaption" w:type="paragraph">
+  <w:style w:type="paragraph" w:customStyle="1" w:styleId="ImageCaption">
     <w:name w:val="Image Caption"/>
-    <w:basedOn w:val="Caption"/>
-  </w:style>
-  <w:style w:customStyle="1" w:styleId="Figure" w:type="paragraph">
+    <w:basedOn w:val="ac"/>
+  </w:style>
+  <w:style w:type="paragraph" w:customStyle="1" w:styleId="Figure">
     <w:name w:val="Figure"/>
-    <w:basedOn w:val="Normal"/>
-  </w:style>
-  <w:style w:customStyle="1" w:styleId="CaptionedFigure" w:type="paragraph">
+    <w:basedOn w:val="a"/>
+  </w:style>
+  <w:style w:type="paragraph" w:customStyle="1" w:styleId="CaptionedFigure">
     <w:name w:val="Captioned Figure"/>
     <w:basedOn w:val="Figure"/>
     <w:pPr>
       <w:keepNext/>
     </w:pPr>
   </w:style>
-  <w:style w:customStyle="1" w:styleId="BodyTextChar" w:type="character">
-    <w:name w:val="Body Text Char"/>
-    <w:basedOn w:val="DefaultParagraphFont"/>
-    <w:link w:val="BodyText"/>
-  </w:style>
-  <w:style w:customStyle="1" w:styleId="VerbatimChar" w:type="character">
+  <w:style w:type="character" w:customStyle="1" w:styleId="ad">
+    <w:name w:val="図表番号 (文字)"/>
+    <w:basedOn w:val="a1"/>
+    <w:link w:val="ac"/>
+  </w:style>
+  <w:style w:type="character" w:customStyle="1" w:styleId="VerbatimChar">
     <w:name w:val="Verbatim Char"/>
-    <w:basedOn w:val="BodyTextChar"/>
-    <w:rPr>
-      <w:rFonts w:ascii="Consolas" w:hAnsi="Consolas"/>
-      <w:sz w:val="22"/>
-    </w:rPr>
-  </w:style>
-  <w:style w:customStyle="1" w:styleId="SectionNumber" w:type="character">
+    <w:basedOn w:val="ad"/>
+    <w:link w:val="SourceCode"/>
+    <w:rPr>
+      <w:rFonts w:ascii="Consolas" w:hAnsi="Consolas"/>
+      <w:sz w:val="22"/>
+    </w:rPr>
+  </w:style>
+  <w:style w:type="character" w:customStyle="1" w:styleId="SectionNumber">
     <w:name w:val="Section Number"/>
-    <w:basedOn w:val="BodyTextChar"/>
-  </w:style>
-  <w:style w:styleId="FootnoteReference" w:type="character">
-    <w:name w:val="Footnote Reference"/>
-    <w:basedOn w:val="BodyTextChar"/>
+    <w:basedOn w:val="ad"/>
+  </w:style>
+  <w:style w:type="character" w:styleId="ae">
+    <w:name w:val="footnote reference"/>
+    <w:basedOn w:val="ad"/>
     <w:rPr>
       <w:vertAlign w:val="superscript"/>
     </w:rPr>
   </w:style>
-  <w:style w:styleId="Hyperlink" w:type="character">
+  <w:style w:type="character" w:styleId="af">
     <w:name w:val="Hyperlink"/>
-    <w:basedOn w:val="BodyTextChar"/>
-    <w:rPr>
-      <w:color w:themeColor="accent1" w:val="4F81BD"/>
-    </w:rPr>
-  </w:style>
-  <w:style w:styleId="TOCHeading" w:type="paragraph">
+    <w:basedOn w:val="ad"/>
+    <w:rPr>
+      <w:color w:val="156082" w:themeColor="accent1"/>
+    </w:rPr>
+  </w:style>
+  <w:style w:type="paragraph" w:styleId="af0">
     <w:name w:val="TOC Heading"/>
-    <w:basedOn w:val="Heading1"/>
-    <w:next w:val="BodyText"/>
+    <w:basedOn w:val="1"/>
+    <w:next w:val="a0"/>
     <w:uiPriority w:val="39"/>
     <w:unhideWhenUsed/>
     <w:qFormat/>
@@ -1828,246 +1998,305 @@
       <w:spacing w:before="240" w:line="259" w:lineRule="auto"/>
       <w:outlineLvl w:val="9"/>
     </w:pPr>
-    <w:rPr>
-      <w:rFonts w:asciiTheme="majorHAnsi" w:cstheme="majorBidi" w:eastAsiaTheme="majorEastAsia" w:hAnsiTheme="majorHAnsi"/>
-      <w:b w:val="0"/>
-      <w:bCs w:val="0"/>
-      <w:color w:themeColor="accent1" w:themeShade="BF" w:val="365F91"/>
-    </w:rPr>
   </w:style>
   <w:style w:type="paragraph" w:customStyle="1" w:styleId="SourceCode">
     <w:name w:val="Source Code"/>
-    <w:basedOn w:val="Normal"/>
+    <w:basedOn w:val="a"/>
     <w:link w:val="VerbatimChar"/>
     <w:pPr>
-      <w:wordWrap w:val="off"/>
+      <w:wordWrap w:val="0"/>
     </w:pPr>
   </w:style>
   <w:style w:type="character" w:customStyle="1" w:styleId="KeywordTok">
     <w:name w:val="KeywordTok"/>
     <w:basedOn w:val="VerbatimChar"/>
     <w:rPr>
+      <w:rFonts w:ascii="Consolas" w:hAnsi="Consolas"/>
       <w:b/>
       <w:color w:val="007020"/>
+      <w:sz w:val="22"/>
     </w:rPr>
   </w:style>
   <w:style w:type="character" w:customStyle="1" w:styleId="DataTypeTok">
     <w:name w:val="DataTypeTok"/>
     <w:basedOn w:val="VerbatimChar"/>
     <w:rPr>
+      <w:rFonts w:ascii="Consolas" w:hAnsi="Consolas"/>
       <w:color w:val="902000"/>
+      <w:sz w:val="22"/>
     </w:rPr>
   </w:style>
   <w:style w:type="character" w:customStyle="1" w:styleId="DecValTok">
     <w:name w:val="DecValTok"/>
     <w:basedOn w:val="VerbatimChar"/>
     <w:rPr>
-      <w:color w:val="40a070"/>
+      <w:rFonts w:ascii="Consolas" w:hAnsi="Consolas"/>
+      <w:color w:val="40A070"/>
+      <w:sz w:val="22"/>
     </w:rPr>
   </w:style>
   <w:style w:type="character" w:customStyle="1" w:styleId="BaseNTok">
     <w:name w:val="BaseNTok"/>
     <w:basedOn w:val="VerbatimChar"/>
     <w:rPr>
-      <w:color w:val="40a070"/>
+      <w:rFonts w:ascii="Consolas" w:hAnsi="Consolas"/>
+      <w:color w:val="40A070"/>
+      <w:sz w:val="22"/>
     </w:rPr>
   </w:style>
   <w:style w:type="character" w:customStyle="1" w:styleId="FloatTok">
     <w:name w:val="FloatTok"/>
     <w:basedOn w:val="VerbatimChar"/>
     <w:rPr>
-      <w:color w:val="40a070"/>
+      <w:rFonts w:ascii="Consolas" w:hAnsi="Consolas"/>
+      <w:color w:val="40A070"/>
+      <w:sz w:val="22"/>
     </w:rPr>
   </w:style>
   <w:style w:type="character" w:customStyle="1" w:styleId="ConstantTok">
     <w:name w:val="ConstantTok"/>
     <w:basedOn w:val="VerbatimChar"/>
     <w:rPr>
+      <w:rFonts w:ascii="Consolas" w:hAnsi="Consolas"/>
       <w:color w:val="880000"/>
+      <w:sz w:val="22"/>
     </w:rPr>
   </w:style>
   <w:style w:type="character" w:customStyle="1" w:styleId="CharTok">
     <w:name w:val="CharTok"/>
     <w:basedOn w:val="VerbatimChar"/>
     <w:rPr>
-      <w:color w:val="4070a0"/>
+      <w:rFonts w:ascii="Consolas" w:hAnsi="Consolas"/>
+      <w:color w:val="4070A0"/>
+      <w:sz w:val="22"/>
     </w:rPr>
   </w:style>
   <w:style w:type="character" w:customStyle="1" w:styleId="SpecialCharTok">
     <w:name w:val="SpecialCharTok"/>
     <w:basedOn w:val="VerbatimChar"/>
     <w:rPr>
-      <w:color w:val="4070a0"/>
+      <w:rFonts w:ascii="Consolas" w:hAnsi="Consolas"/>
+      <w:color w:val="4070A0"/>
+      <w:sz w:val="22"/>
     </w:rPr>
   </w:style>
   <w:style w:type="character" w:customStyle="1" w:styleId="StringTok">
     <w:name w:val="StringTok"/>
     <w:basedOn w:val="VerbatimChar"/>
     <w:rPr>
-      <w:color w:val="4070a0"/>
+      <w:rFonts w:ascii="Consolas" w:hAnsi="Consolas"/>
+      <w:color w:val="4070A0"/>
+      <w:sz w:val="22"/>
     </w:rPr>
   </w:style>
   <w:style w:type="character" w:customStyle="1" w:styleId="VerbatimStringTok">
     <w:name w:val="VerbatimStringTok"/>
     <w:basedOn w:val="VerbatimChar"/>
     <w:rPr>
-      <w:color w:val="4070a0"/>
+      <w:rFonts w:ascii="Consolas" w:hAnsi="Consolas"/>
+      <w:color w:val="4070A0"/>
+      <w:sz w:val="22"/>
     </w:rPr>
   </w:style>
   <w:style w:type="character" w:customStyle="1" w:styleId="SpecialStringTok">
     <w:name w:val="SpecialStringTok"/>
     <w:basedOn w:val="VerbatimChar"/>
     <w:rPr>
-      <w:color w:val="bb6688"/>
+      <w:rFonts w:ascii="Consolas" w:hAnsi="Consolas"/>
+      <w:color w:val="BB6688"/>
+      <w:sz w:val="22"/>
     </w:rPr>
   </w:style>
   <w:style w:type="character" w:customStyle="1" w:styleId="ImportTok">
     <w:name w:val="ImportTok"/>
     <w:basedOn w:val="VerbatimChar"/>
     <w:rPr>
+      <w:rFonts w:ascii="Consolas" w:hAnsi="Consolas"/>
       <w:b/>
       <w:color w:val="008000"/>
+      <w:sz w:val="22"/>
     </w:rPr>
   </w:style>
   <w:style w:type="character" w:customStyle="1" w:styleId="CommentTok">
     <w:name w:val="CommentTok"/>
     <w:basedOn w:val="VerbatimChar"/>
     <w:rPr>
+      <w:rFonts w:ascii="Consolas" w:hAnsi="Consolas"/>
       <w:i/>
-      <w:color w:val="60a0b0"/>
+      <w:color w:val="60A0B0"/>
+      <w:sz w:val="22"/>
     </w:rPr>
   </w:style>
   <w:style w:type="character" w:customStyle="1" w:styleId="DocumentationTok">
     <w:name w:val="DocumentationTok"/>
     <w:basedOn w:val="VerbatimChar"/>
     <w:rPr>
+      <w:rFonts w:ascii="Consolas" w:hAnsi="Consolas"/>
       <w:i/>
-      <w:color w:val="ba2121"/>
+      <w:color w:val="BA2121"/>
+      <w:sz w:val="22"/>
     </w:rPr>
   </w:style>
   <w:style w:type="character" w:customStyle="1" w:styleId="AnnotationTok">
     <w:name w:val="AnnotationTok"/>
     <w:basedOn w:val="VerbatimChar"/>
     <w:rPr>
+      <w:rFonts w:ascii="Consolas" w:hAnsi="Consolas"/>
       <w:b/>
       <w:i/>
-      <w:color w:val="60a0b0"/>
+      <w:color w:val="60A0B0"/>
+      <w:sz w:val="22"/>
     </w:rPr>
   </w:style>
   <w:style w:type="character" w:customStyle="1" w:styleId="CommentVarTok">
     <w:name w:val="CommentVarTok"/>
     <w:basedOn w:val="VerbatimChar"/>
     <w:rPr>
+      <w:rFonts w:ascii="Consolas" w:hAnsi="Consolas"/>
       <w:b/>
       <w:i/>
-      <w:color w:val="60a0b0"/>
+      <w:color w:val="60A0B0"/>
+      <w:sz w:val="22"/>
     </w:rPr>
   </w:style>
   <w:style w:type="character" w:customStyle="1" w:styleId="OtherTok">
     <w:name w:val="OtherTok"/>
     <w:basedOn w:val="VerbatimChar"/>
     <w:rPr>
+      <w:rFonts w:ascii="Consolas" w:hAnsi="Consolas"/>
       <w:color w:val="007020"/>
+      <w:sz w:val="22"/>
     </w:rPr>
   </w:style>
   <w:style w:type="character" w:customStyle="1" w:styleId="FunctionTok">
     <w:name w:val="FunctionTok"/>
     <w:basedOn w:val="VerbatimChar"/>
     <w:rPr>
-      <w:color w:val="06287e"/>
+      <w:rFonts w:ascii="Consolas" w:hAnsi="Consolas"/>
+      <w:color w:val="06287E"/>
+      <w:sz w:val="22"/>
     </w:rPr>
   </w:style>
   <w:style w:type="character" w:customStyle="1" w:styleId="VariableTok">
     <w:name w:val="VariableTok"/>
     <w:basedOn w:val="VerbatimChar"/>
     <w:rPr>
-      <w:color w:val="19177c"/>
+      <w:rFonts w:ascii="Consolas" w:hAnsi="Consolas"/>
+      <w:color w:val="19177C"/>
+      <w:sz w:val="22"/>
     </w:rPr>
   </w:style>
   <w:style w:type="character" w:customStyle="1" w:styleId="ControlFlowTok">
     <w:name w:val="ControlFlowTok"/>
     <w:basedOn w:val="VerbatimChar"/>
     <w:rPr>
+      <w:rFonts w:ascii="Consolas" w:hAnsi="Consolas"/>
       <w:b/>
       <w:color w:val="007020"/>
+      <w:sz w:val="22"/>
     </w:rPr>
   </w:style>
   <w:style w:type="character" w:customStyle="1" w:styleId="OperatorTok">
     <w:name w:val="OperatorTok"/>
     <w:basedOn w:val="VerbatimChar"/>
     <w:rPr>
+      <w:rFonts w:ascii="Consolas" w:hAnsi="Consolas"/>
       <w:color w:val="666666"/>
+      <w:sz w:val="22"/>
     </w:rPr>
   </w:style>
   <w:style w:type="character" w:customStyle="1" w:styleId="BuiltInTok">
     <w:name w:val="BuiltInTok"/>
     <w:basedOn w:val="VerbatimChar"/>
     <w:rPr>
+      <w:rFonts w:ascii="Consolas" w:hAnsi="Consolas"/>
       <w:color w:val="008000"/>
+      <w:sz w:val="22"/>
     </w:rPr>
   </w:style>
   <w:style w:type="character" w:customStyle="1" w:styleId="ExtensionTok">
     <w:name w:val="ExtensionTok"/>
     <w:basedOn w:val="VerbatimChar"/>
-    <w:rPr/>
+    <w:rPr>
+      <w:rFonts w:ascii="Consolas" w:hAnsi="Consolas"/>
+      <w:sz w:val="22"/>
+    </w:rPr>
   </w:style>
   <w:style w:type="character" w:customStyle="1" w:styleId="PreprocessorTok">
     <w:name w:val="PreprocessorTok"/>
     <w:basedOn w:val="VerbatimChar"/>
     <w:rPr>
-      <w:color w:val="bc7a00"/>
+      <w:rFonts w:ascii="Consolas" w:hAnsi="Consolas"/>
+      <w:color w:val="BC7A00"/>
+      <w:sz w:val="22"/>
     </w:rPr>
   </w:style>
   <w:style w:type="character" w:customStyle="1" w:styleId="AttributeTok">
     <w:name w:val="AttributeTok"/>
     <w:basedOn w:val="VerbatimChar"/>
     <w:rPr>
-      <w:color w:val="7d9029"/>
+      <w:rFonts w:ascii="Consolas" w:hAnsi="Consolas"/>
+      <w:color w:val="7D9029"/>
+      <w:sz w:val="22"/>
     </w:rPr>
   </w:style>
   <w:style w:type="character" w:customStyle="1" w:styleId="RegionMarkerTok">
     <w:name w:val="RegionMarkerTok"/>
     <w:basedOn w:val="VerbatimChar"/>
-    <w:rPr/>
+    <w:rPr>
+      <w:rFonts w:ascii="Consolas" w:hAnsi="Consolas"/>
+      <w:sz w:val="22"/>
+    </w:rPr>
   </w:style>
   <w:style w:type="character" w:customStyle="1" w:styleId="InformationTok">
     <w:name w:val="InformationTok"/>
     <w:basedOn w:val="VerbatimChar"/>
     <w:rPr>
+      <w:rFonts w:ascii="Consolas" w:hAnsi="Consolas"/>
       <w:b/>
       <w:i/>
-      <w:color w:val="60a0b0"/>
+      <w:color w:val="60A0B0"/>
+      <w:sz w:val="22"/>
     </w:rPr>
   </w:style>
   <w:style w:type="character" w:customStyle="1" w:styleId="WarningTok">
     <w:name w:val="WarningTok"/>
     <w:basedOn w:val="VerbatimChar"/>
     <w:rPr>
+      <w:rFonts w:ascii="Consolas" w:hAnsi="Consolas"/>
       <w:b/>
       <w:i/>
-      <w:color w:val="60a0b0"/>
+      <w:color w:val="60A0B0"/>
+      <w:sz w:val="22"/>
     </w:rPr>
   </w:style>
   <w:style w:type="character" w:customStyle="1" w:styleId="AlertTok">
     <w:name w:val="AlertTok"/>
     <w:basedOn w:val="VerbatimChar"/>
     <w:rPr>
+      <w:rFonts w:ascii="Consolas" w:hAnsi="Consolas"/>
       <w:b/>
-      <w:color w:val="ff0000"/>
+      <w:color w:val="FF0000"/>
+      <w:sz w:val="22"/>
     </w:rPr>
   </w:style>
   <w:style w:type="character" w:customStyle="1" w:styleId="ErrorTok">
     <w:name w:val="ErrorTok"/>
     <w:basedOn w:val="VerbatimChar"/>
     <w:rPr>
+      <w:rFonts w:ascii="Consolas" w:hAnsi="Consolas"/>
       <w:b/>
-      <w:color w:val="ff0000"/>
+      <w:color w:val="FF0000"/>
+      <w:sz w:val="22"/>
     </w:rPr>
   </w:style>
   <w:style w:type="character" w:customStyle="1" w:styleId="NormalTok">
     <w:name w:val="NormalTok"/>
     <w:basedOn w:val="VerbatimChar"/>
-    <w:rPr/>
+    <w:rPr>
+      <w:rFonts w:ascii="Consolas" w:hAnsi="Consolas"/>
+      <w:sz w:val="22"/>
+    </w:rPr>
   </w:style>
 </w:styles>
 </file>

</xml_diff>